<commit_message>
thêm lstm + data + sửa huấn luyện model
</commit_message>
<xml_diff>
--- a/docs/Report_TLCN.docx
+++ b/docs/Report_TLCN.docx
@@ -1055,21 +1055,37 @@
           <w:i/>
           <w:iCs/>
         </w:rPr>
-        <w:t>Thành phố Hồ Chí Minh, ngày</w:t>
-      </w:r>
+        <w:t xml:space="preserve">Thành phố Hồ Chí Minh, </w:t>
+      </w:r>
+      <w:proofErr w:type="gramStart"/>
       <w:r>
         <w:rPr>
           <w:i/>
           <w:iCs/>
         </w:rPr>
-        <w:t xml:space="preserve"> </w:t>
+        <w:t>ngày</w:t>
       </w:r>
       <w:r>
         <w:rPr>
           <w:i/>
           <w:iCs/>
         </w:rPr>
-        <w:t xml:space="preserve"> tháng  năm 202</w:t>
+        <w:t xml:space="preserve"> </w:t>
+      </w:r>
+      <w:r>
+        <w:rPr>
+          <w:i/>
+          <w:iCs/>
+        </w:rPr>
+        <w:t xml:space="preserve"> tháng</w:t>
+      </w:r>
+      <w:proofErr w:type="gramEnd"/>
+      <w:r>
+        <w:rPr>
+          <w:i/>
+          <w:iCs/>
+        </w:rPr>
+        <w:t xml:space="preserve">  năm 202</w:t>
       </w:r>
       <w:r>
         <w:rPr>
@@ -1721,14 +1737,15 @@
           <w:i/>
           <w:iCs/>
         </w:rPr>
-        <w:t>Thành phố Hồ Chí Minh, ngày</w:t>
-      </w:r>
+        <w:t xml:space="preserve">Thành phố Hồ Chí Minh, </w:t>
+      </w:r>
+      <w:proofErr w:type="gramStart"/>
       <w:r>
         <w:rPr>
           <w:i/>
           <w:iCs/>
         </w:rPr>
-        <w:t xml:space="preserve"> </w:t>
+        <w:t>ngày</w:t>
       </w:r>
       <w:r>
         <w:rPr>
@@ -1742,7 +1759,22 @@
           <w:i/>
           <w:iCs/>
         </w:rPr>
-        <w:t>tháng  năm 202</w:t>
+        <w:t xml:space="preserve"> </w:t>
+      </w:r>
+      <w:r>
+        <w:rPr>
+          <w:i/>
+          <w:iCs/>
+        </w:rPr>
+        <w:t>tháng</w:t>
+      </w:r>
+      <w:proofErr w:type="gramEnd"/>
+      <w:r>
+        <w:rPr>
+          <w:i/>
+          <w:iCs/>
+        </w:rPr>
+        <w:t xml:space="preserve">  năm 202</w:t>
       </w:r>
       <w:r>
         <w:rPr>
@@ -4490,6 +4522,7 @@
     <w:p>
       <w:pPr>
         <w:pStyle w:val="Heading2"/>
+        <w:ind w:firstLine="0"/>
       </w:pPr>
       <w:r>
         <w:t>1.6. Tương quan giữa các biến trong chuỗi thời gian</w:t>
@@ -4621,16 +4654,10 @@
         <w:pStyle w:val="Heading2"/>
       </w:pPr>
       <w:r>
-        <w:t xml:space="preserve">1.7. Kết luận </w:t>
-      </w:r>
-      <w:r>
-        <w:t>chương</w:t>
-      </w:r>
-      <w:r>
-        <w:t xml:space="preserve"> 1</w:t>
-      </w:r>
-      <w:r>
-        <w:t xml:space="preserve"> </w:t>
+        <w:t>1.7. Kế</w:t>
+      </w:r>
+      <w:r>
+        <w:t>t chương</w:t>
       </w:r>
     </w:p>
     <w:p>
@@ -11440,6 +11467,15 @@
     </w:p>
     <w:p>
       <w:pPr>
+        <w:pStyle w:val="Heading2"/>
+        <w:ind w:firstLine="0"/>
+      </w:pPr>
+      <w:r>
+        <w:t>2.5. Kết chương</w:t>
+      </w:r>
+    </w:p>
+    <w:p>
+      <w:pPr>
         <w:ind w:firstLine="0"/>
         <w:jc w:val="left"/>
       </w:pPr>
@@ -12840,7 +12876,6 @@
           <w:id w:val="-856027820"/>
           <w:citation/>
         </w:sdtPr>
-        <w:sdtEndPr/>
         <w:sdtContent>
           <w:r>
             <w:rPr>
@@ -13130,7 +13165,6 @@
           <w:id w:val="-1208104547"/>
           <w:citation/>
         </w:sdtPr>
-        <w:sdtEndPr/>
         <w:sdtContent>
           <w:r>
             <w:rPr>
@@ -14102,7 +14136,6 @@
           <w:id w:val="1741516052"/>
           <w:citation/>
         </w:sdtPr>
-        <w:sdtEndPr/>
         <w:sdtContent>
           <w:r>
             <w:fldChar w:fldCharType="begin"/>
@@ -14981,7 +15014,6 @@
           <w:id w:val="-1693291696"/>
           <w:citation/>
         </w:sdtPr>
-        <w:sdtEndPr/>
         <w:sdtContent>
           <w:r>
             <w:rPr>
@@ -16299,7 +16331,6 @@
           <w:id w:val="235294619"/>
           <w:citation/>
         </w:sdtPr>
-        <w:sdtEndPr/>
         <w:sdtContent>
           <w:r>
             <w:fldChar w:fldCharType="begin"/>
@@ -16946,7 +16977,6 @@
           <w:id w:val="1678230039"/>
           <w:citation/>
         </w:sdtPr>
-        <w:sdtEndPr/>
         <w:sdtContent>
           <w:r>
             <w:rPr>
@@ -17586,7 +17616,6 @@
           <w:id w:val="656341937"/>
           <w:citation/>
         </w:sdtPr>
-        <w:sdtEndPr/>
         <w:sdtContent>
           <w:r>
             <w:fldChar w:fldCharType="begin"/>
@@ -17845,7 +17874,6 @@
           <w:id w:val="600681951"/>
           <w:citation/>
         </w:sdtPr>
-        <w:sdtEndPr/>
         <w:sdtContent>
           <w:r>
             <w:fldChar w:fldCharType="begin"/>
@@ -20634,13 +20662,2821 @@
         <w:rPr>
           <w:lang w:val="vi-VN"/>
         </w:rPr>
-        <w:t>3.2.1. Nguồn dữ liệu và Xử lý khuyết thiế</w:t>
-      </w:r>
-      <w:r>
-        <w:rPr>
-          <w:lang w:val="vi-VN"/>
-        </w:rPr>
-        <w:t>u</w:t>
+        <w:t xml:space="preserve">3.2.1. </w:t>
+      </w:r>
+      <w:r>
+        <w:rPr>
+          <w:lang w:val="vi-VN"/>
+        </w:rPr>
+        <w:t>Tổng quan về tập dữ li</w:t>
+      </w:r>
+      <w:r>
+        <w:rPr>
+          <w:lang w:val="vi-VN"/>
+        </w:rPr>
+        <w:t>ệu</w:t>
+      </w:r>
+    </w:p>
+    <w:p>
+      <w:pPr>
+        <w:rPr>
+          <w:lang w:val="vi-VN"/>
+        </w:rPr>
+      </w:pPr>
+      <w:r>
+        <w:rPr>
+          <w:lang w:val="vi-VN"/>
+        </w:rPr>
+        <w:t>Để phục vụ cho bài t</w:t>
+      </w:r>
+      <w:r>
+        <w:rPr>
+          <w:lang w:val="vi-VN"/>
+        </w:rPr>
+        <w:t xml:space="preserve">oán </w:t>
+      </w:r>
+      <w:r>
+        <w:rPr>
+          <w:lang w:val="vi-VN"/>
+        </w:rPr>
+        <w:t>d</w:t>
+      </w:r>
+      <w:r>
+        <w:rPr>
+          <w:lang w:val="vi-VN"/>
+        </w:rPr>
+        <w:t>ự</w:t>
+      </w:r>
+      <w:r>
+        <w:rPr>
+          <w:lang w:val="vi-VN"/>
+        </w:rPr>
+        <w:t xml:space="preserve"> b</w:t>
+      </w:r>
+      <w:r>
+        <w:rPr>
+          <w:lang w:val="vi-VN"/>
+        </w:rPr>
+        <w:t>áo</w:t>
+      </w:r>
+      <w:r>
+        <w:rPr>
+          <w:lang w:val="vi-VN"/>
+        </w:rPr>
+        <w:t>, d</w:t>
+      </w:r>
+      <w:r>
+        <w:rPr>
+          <w:lang w:val="vi-VN"/>
+        </w:rPr>
+        <w:t>ữ</w:t>
+      </w:r>
+      <w:r>
+        <w:rPr>
+          <w:lang w:val="vi-VN"/>
+        </w:rPr>
+        <w:t xml:space="preserve"> li</w:t>
+      </w:r>
+      <w:r>
+        <w:rPr>
+          <w:lang w:val="vi-VN"/>
+        </w:rPr>
+        <w:t>ệu</w:t>
+      </w:r>
+      <w:r>
+        <w:rPr>
+          <w:lang w:val="vi-VN"/>
+        </w:rPr>
+        <w:t xml:space="preserve"> </w:t>
+      </w:r>
+      <w:r>
+        <w:rPr>
+          <w:lang w:val="vi-VN"/>
+        </w:rPr>
+        <w:t>đượ</w:t>
+      </w:r>
+      <w:r>
+        <w:rPr>
+          <w:lang w:val="vi-VN"/>
+        </w:rPr>
+        <w:t>c x</w:t>
+      </w:r>
+      <w:r>
+        <w:rPr>
+          <w:lang w:val="vi-VN"/>
+        </w:rPr>
+        <w:t>ây</w:t>
+      </w:r>
+      <w:r>
+        <w:rPr>
+          <w:lang w:val="vi-VN"/>
+        </w:rPr>
+        <w:t xml:space="preserve"> d</w:t>
+      </w:r>
+      <w:r>
+        <w:rPr>
+          <w:lang w:val="vi-VN"/>
+        </w:rPr>
+        <w:t>ựn</w:t>
+      </w:r>
+      <w:r>
+        <w:rPr>
+          <w:lang w:val="vi-VN"/>
+        </w:rPr>
+        <w:t>g t</w:t>
+      </w:r>
+      <w:r>
+        <w:rPr>
+          <w:lang w:val="vi-VN"/>
+        </w:rPr>
+        <w:t>ừ</w:t>
+      </w:r>
+      <w:r>
+        <w:rPr>
+          <w:lang w:val="vi-VN"/>
+        </w:rPr>
+        <w:t xml:space="preserve"> nhi</w:t>
+      </w:r>
+      <w:r>
+        <w:rPr>
+          <w:lang w:val="vi-VN"/>
+        </w:rPr>
+        <w:t>ều</w:t>
+      </w:r>
+      <w:r>
+        <w:rPr>
+          <w:lang w:val="vi-VN"/>
+        </w:rPr>
+        <w:t xml:space="preserve"> ngu</w:t>
+      </w:r>
+      <w:r>
+        <w:rPr>
+          <w:lang w:val="vi-VN"/>
+        </w:rPr>
+        <w:t>ồn</w:t>
+      </w:r>
+      <w:r>
+        <w:rPr>
+          <w:lang w:val="vi-VN"/>
+        </w:rPr>
+        <w:t xml:space="preserve"> kh</w:t>
+      </w:r>
+      <w:r>
+        <w:rPr>
+          <w:lang w:val="vi-VN"/>
+        </w:rPr>
+        <w:t>ác</w:t>
+      </w:r>
+      <w:r>
+        <w:rPr>
+          <w:lang w:val="vi-VN"/>
+        </w:rPr>
+        <w:t xml:space="preserve"> nhau v</w:t>
+      </w:r>
+      <w:r>
+        <w:rPr>
+          <w:lang w:val="vi-VN"/>
+        </w:rPr>
+        <w:t>à</w:t>
+      </w:r>
+      <w:r>
+        <w:rPr>
+          <w:lang w:val="vi-VN"/>
+        </w:rPr>
+        <w:t xml:space="preserve"> </w:t>
+      </w:r>
+      <w:r>
+        <w:rPr>
+          <w:lang w:val="vi-VN"/>
+        </w:rPr>
+        <w:t>đượ</w:t>
+      </w:r>
+      <w:r>
+        <w:rPr>
+          <w:lang w:val="vi-VN"/>
+        </w:rPr>
+        <w:t>c t</w:t>
+      </w:r>
+      <w:r>
+        <w:rPr>
+          <w:lang w:val="vi-VN"/>
+        </w:rPr>
+        <w:t xml:space="preserve">ổng </w:t>
+      </w:r>
+      <w:r>
+        <w:rPr>
+          <w:lang w:val="vi-VN"/>
+        </w:rPr>
+        <w:t>h</w:t>
+      </w:r>
+      <w:r>
+        <w:rPr>
+          <w:lang w:val="vi-VN"/>
+        </w:rPr>
+        <w:t>ợp</w:t>
+      </w:r>
+      <w:r>
+        <w:rPr>
+          <w:lang w:val="vi-VN"/>
+        </w:rPr>
+        <w:t xml:space="preserve"> th</w:t>
+      </w:r>
+      <w:r>
+        <w:rPr>
+          <w:lang w:val="vi-VN"/>
+        </w:rPr>
+        <w:t xml:space="preserve">ành </w:t>
+      </w:r>
+      <w:r>
+        <w:rPr>
+          <w:lang w:val="vi-VN"/>
+        </w:rPr>
+        <w:t>m</w:t>
+      </w:r>
+      <w:r>
+        <w:rPr>
+          <w:lang w:val="vi-VN"/>
+        </w:rPr>
+        <w:t>ộ</w:t>
+      </w:r>
+      <w:r>
+        <w:rPr>
+          <w:lang w:val="vi-VN"/>
+        </w:rPr>
+        <w:t>t t</w:t>
+      </w:r>
+      <w:r>
+        <w:rPr>
+          <w:lang w:val="vi-VN"/>
+        </w:rPr>
+        <w:t>ập</w:t>
+      </w:r>
+      <w:r>
+        <w:rPr>
+          <w:lang w:val="vi-VN"/>
+        </w:rPr>
+        <w:t xml:space="preserve"> d</w:t>
+      </w:r>
+      <w:r>
+        <w:rPr>
+          <w:lang w:val="vi-VN"/>
+        </w:rPr>
+        <w:t>ữ</w:t>
+      </w:r>
+      <w:r>
+        <w:rPr>
+          <w:lang w:val="vi-VN"/>
+        </w:rPr>
+        <w:t xml:space="preserve"> li</w:t>
+      </w:r>
+      <w:r>
+        <w:rPr>
+          <w:lang w:val="vi-VN"/>
+        </w:rPr>
+        <w:t xml:space="preserve">ệu </w:t>
+      </w:r>
+      <w:r>
+        <w:rPr>
+          <w:lang w:val="vi-VN"/>
+        </w:rPr>
+        <w:t>d</w:t>
+      </w:r>
+      <w:r>
+        <w:rPr>
+          <w:lang w:val="vi-VN"/>
+        </w:rPr>
+        <w:t>ạng</w:t>
+      </w:r>
+      <w:r>
+        <w:rPr>
+          <w:lang w:val="vi-VN"/>
+        </w:rPr>
+        <w:t xml:space="preserve"> b</w:t>
+      </w:r>
+      <w:r>
+        <w:rPr>
+          <w:lang w:val="vi-VN"/>
+        </w:rPr>
+        <w:t>ảng</w:t>
+      </w:r>
+      <w:r>
+        <w:rPr>
+          <w:lang w:val="vi-VN"/>
+        </w:rPr>
+        <w:t xml:space="preserve"> thu th</w:t>
+      </w:r>
+      <w:r>
+        <w:rPr>
+          <w:lang w:val="vi-VN"/>
+        </w:rPr>
+        <w:t>ập</w:t>
+      </w:r>
+      <w:r>
+        <w:rPr>
+          <w:lang w:val="vi-VN"/>
+        </w:rPr>
+        <w:t xml:space="preserve"> theo t</w:t>
+      </w:r>
+      <w:r>
+        <w:rPr>
+          <w:lang w:val="vi-VN"/>
+        </w:rPr>
+        <w:t>ừng n</w:t>
+      </w:r>
+      <w:r>
+        <w:rPr>
+          <w:lang w:val="vi-VN"/>
+        </w:rPr>
+        <w:t>g</w:t>
+      </w:r>
+      <w:r>
+        <w:rPr>
+          <w:lang w:val="vi-VN"/>
+        </w:rPr>
+        <w:t>ày</w:t>
+      </w:r>
+      <w:r>
+        <w:rPr>
+          <w:lang w:val="vi-VN"/>
+        </w:rPr>
+        <w:t>. Bao gồm giá thu mua cà phê ở Việt Nam t</w:t>
+      </w:r>
+      <w:r>
+        <w:rPr>
+          <w:lang w:val="vi-VN"/>
+        </w:rPr>
+        <w:t>ại</w:t>
+      </w:r>
+      <w:r>
+        <w:rPr>
+          <w:lang w:val="vi-VN"/>
+        </w:rPr>
+        <w:t xml:space="preserve"> c</w:t>
+      </w:r>
+      <w:r>
+        <w:rPr>
+          <w:lang w:val="vi-VN"/>
+        </w:rPr>
+        <w:t>ác</w:t>
+      </w:r>
+      <w:r>
+        <w:rPr>
+          <w:lang w:val="vi-VN"/>
+        </w:rPr>
+        <w:t xml:space="preserve"> t</w:t>
+      </w:r>
+      <w:r>
+        <w:rPr>
+          <w:lang w:val="vi-VN"/>
+        </w:rPr>
+        <w:t>ỉ</w:t>
+      </w:r>
+      <w:r>
+        <w:rPr>
+          <w:lang w:val="vi-VN"/>
+        </w:rPr>
+        <w:t>nh c</w:t>
+      </w:r>
+      <w:r>
+        <w:rPr>
+          <w:lang w:val="vi-VN"/>
+        </w:rPr>
+        <w:t>à</w:t>
+      </w:r>
+      <w:r>
+        <w:rPr>
+          <w:lang w:val="vi-VN"/>
+        </w:rPr>
+        <w:t xml:space="preserve"> ph</w:t>
+      </w:r>
+      <w:r>
+        <w:rPr>
+          <w:lang w:val="vi-VN"/>
+        </w:rPr>
+        <w:t>ê</w:t>
+      </w:r>
+      <w:r>
+        <w:rPr>
+          <w:lang w:val="vi-VN"/>
+        </w:rPr>
+        <w:t xml:space="preserve"> tr</w:t>
+      </w:r>
+      <w:r>
+        <w:rPr>
+          <w:lang w:val="vi-VN"/>
+        </w:rPr>
+        <w:t>ọng</w:t>
+      </w:r>
+      <w:r>
+        <w:rPr>
+          <w:lang w:val="vi-VN"/>
+        </w:rPr>
+        <w:t xml:space="preserve"> </w:t>
+      </w:r>
+      <w:r>
+        <w:rPr>
+          <w:lang w:val="vi-VN"/>
+        </w:rPr>
+        <w:t>đ</w:t>
+      </w:r>
+      <w:r>
+        <w:rPr>
+          <w:lang w:val="vi-VN"/>
+        </w:rPr>
+        <w:t>i</w:t>
+      </w:r>
+      <w:r>
+        <w:rPr>
+          <w:lang w:val="vi-VN"/>
+        </w:rPr>
+        <w:t>ểm</w:t>
+      </w:r>
+      <w:r>
+        <w:rPr>
+          <w:lang w:val="vi-VN"/>
+        </w:rPr>
+        <w:t xml:space="preserve"> trong giai </w:t>
+      </w:r>
+      <w:r>
+        <w:rPr>
+          <w:lang w:val="vi-VN"/>
+        </w:rPr>
+        <w:t>đ</w:t>
+      </w:r>
+      <w:r>
+        <w:rPr>
+          <w:lang w:val="vi-VN"/>
+        </w:rPr>
+        <w:t>o</w:t>
+      </w:r>
+      <w:r>
+        <w:rPr>
+          <w:lang w:val="vi-VN"/>
+        </w:rPr>
+        <w:t xml:space="preserve">ạn </w:t>
+      </w:r>
+      <w:r>
+        <w:rPr>
+          <w:lang w:val="vi-VN"/>
+        </w:rPr>
+        <w:t>t</w:t>
+      </w:r>
+      <w:r>
+        <w:rPr>
+          <w:lang w:val="vi-VN"/>
+        </w:rPr>
+        <w:t>ừ</w:t>
+      </w:r>
+      <w:r>
+        <w:rPr>
+          <w:lang w:val="vi-VN"/>
+        </w:rPr>
+        <w:t xml:space="preserve"> ng</w:t>
+      </w:r>
+      <w:r>
+        <w:rPr>
+          <w:lang w:val="vi-VN"/>
+        </w:rPr>
+        <w:t>ày</w:t>
+      </w:r>
+      <w:r>
+        <w:rPr>
+          <w:lang w:val="vi-VN"/>
+        </w:rPr>
+        <w:t xml:space="preserve"> 01/01/2010 </w:t>
+      </w:r>
+      <w:r>
+        <w:rPr>
+          <w:lang w:val="vi-VN"/>
+        </w:rPr>
+        <w:t>đến</w:t>
+      </w:r>
+      <w:r>
+        <w:rPr>
+          <w:lang w:val="vi-VN"/>
+        </w:rPr>
+        <w:t xml:space="preserve"> 01/07/2026, t</w:t>
+      </w:r>
+      <w:r>
+        <w:rPr>
+          <w:lang w:val="vi-VN"/>
+        </w:rPr>
+        <w:t>ươ</w:t>
+      </w:r>
+      <w:r>
+        <w:rPr>
+          <w:lang w:val="vi-VN"/>
+        </w:rPr>
+        <w:t xml:space="preserve">ng </w:t>
+      </w:r>
+      <w:r>
+        <w:rPr>
+          <w:lang w:val="vi-VN"/>
+        </w:rPr>
+        <w:t>ứng</w:t>
+      </w:r>
+      <w:r>
+        <w:rPr>
+          <w:lang w:val="vi-VN"/>
+        </w:rPr>
+        <w:t xml:space="preserve"> v</w:t>
+      </w:r>
+      <w:r>
+        <w:rPr>
+          <w:lang w:val="vi-VN"/>
+        </w:rPr>
+        <w:t>ới</w:t>
+      </w:r>
+      <w:r>
+        <w:rPr>
+          <w:lang w:val="vi-VN"/>
+        </w:rPr>
+        <w:t xml:space="preserve"> kho</w:t>
+      </w:r>
+      <w:r>
+        <w:rPr>
+          <w:lang w:val="vi-VN"/>
+        </w:rPr>
+        <w:t>ảng</w:t>
+      </w:r>
+      <w:r>
+        <w:rPr>
+          <w:lang w:val="vi-VN"/>
+        </w:rPr>
+        <w:t xml:space="preserve"> 16 n</w:t>
+      </w:r>
+      <w:r>
+        <w:rPr>
+          <w:lang w:val="vi-VN"/>
+        </w:rPr>
+        <w:t>ă</w:t>
+      </w:r>
+      <w:r>
+        <w:rPr>
+          <w:lang w:val="vi-VN"/>
+        </w:rPr>
+        <w:t>m quan s</w:t>
+      </w:r>
+      <w:r>
+        <w:rPr>
+          <w:lang w:val="vi-VN"/>
+        </w:rPr>
+        <w:t>át</w:t>
+      </w:r>
+      <w:r>
+        <w:rPr>
+          <w:lang w:val="vi-VN"/>
+        </w:rPr>
+        <w:t xml:space="preserve"> li</w:t>
+      </w:r>
+      <w:r>
+        <w:rPr>
+          <w:lang w:val="vi-VN"/>
+        </w:rPr>
+        <w:t xml:space="preserve">ên </w:t>
+      </w:r>
+      <w:r>
+        <w:rPr>
+          <w:lang w:val="vi-VN"/>
+        </w:rPr>
+        <w:t>t</w:t>
+      </w:r>
+      <w:r>
+        <w:rPr>
+          <w:lang w:val="vi-VN"/>
+        </w:rPr>
+        <w:t>ục</w:t>
+      </w:r>
+      <w:r>
+        <w:rPr>
+          <w:lang w:val="vi-VN"/>
+        </w:rPr>
+        <w:t>.</w:t>
+      </w:r>
+    </w:p>
+    <w:p>
+      <w:pPr>
+        <w:rPr>
+          <w:lang w:val="vi-VN"/>
+        </w:rPr>
+      </w:pPr>
+      <w:r>
+        <w:rPr>
+          <w:lang w:val="vi-VN"/>
+        </w:rPr>
+        <w:t>Tập dữ liệu này kh</w:t>
+      </w:r>
+      <w:r>
+        <w:rPr>
+          <w:lang w:val="vi-VN"/>
+        </w:rPr>
+        <w:t>ô</w:t>
+      </w:r>
+      <w:r>
+        <w:rPr>
+          <w:lang w:val="vi-VN"/>
+        </w:rPr>
+        <w:t>ng ch</w:t>
+      </w:r>
+      <w:r>
+        <w:rPr>
+          <w:lang w:val="vi-VN"/>
+        </w:rPr>
+        <w:t>ỉ</w:t>
+      </w:r>
+      <w:r>
+        <w:rPr>
+          <w:lang w:val="vi-VN"/>
+        </w:rPr>
+        <w:t xml:space="preserve"> </w:t>
+      </w:r>
+      <w:r>
+        <w:rPr>
+          <w:lang w:val="vi-VN"/>
+        </w:rPr>
+        <w:t>đơ</w:t>
+      </w:r>
+      <w:r>
+        <w:rPr>
+          <w:lang w:val="vi-VN"/>
+        </w:rPr>
+        <w:t>n thu</w:t>
+      </w:r>
+      <w:r>
+        <w:rPr>
+          <w:lang w:val="vi-VN"/>
+        </w:rPr>
+        <w:t xml:space="preserve">ần </w:t>
+      </w:r>
+      <w:r>
+        <w:rPr>
+          <w:lang w:val="vi-VN"/>
+        </w:rPr>
+        <w:t>l</w:t>
+      </w:r>
+      <w:r>
+        <w:rPr>
+          <w:lang w:val="vi-VN"/>
+        </w:rPr>
+        <w:t>à</w:t>
+      </w:r>
+      <w:r>
+        <w:rPr>
+          <w:lang w:val="vi-VN"/>
+        </w:rPr>
+        <w:t xml:space="preserve"> nh</w:t>
+      </w:r>
+      <w:r>
+        <w:rPr>
+          <w:lang w:val="vi-VN"/>
+        </w:rPr>
+        <w:t>ững</w:t>
+      </w:r>
+      <w:r>
+        <w:rPr>
+          <w:lang w:val="vi-VN"/>
+        </w:rPr>
+        <w:t xml:space="preserve"> con s</w:t>
+      </w:r>
+      <w:r>
+        <w:rPr>
+          <w:lang w:val="vi-VN"/>
+        </w:rPr>
+        <w:t xml:space="preserve">ố </w:t>
+      </w:r>
+      <w:r>
+        <w:rPr>
+          <w:lang w:val="vi-VN"/>
+        </w:rPr>
+        <w:t>v</w:t>
+      </w:r>
+      <w:r>
+        <w:rPr>
+          <w:lang w:val="vi-VN"/>
+        </w:rPr>
+        <w:t>ề</w:t>
+      </w:r>
+      <w:r>
+        <w:rPr>
+          <w:lang w:val="vi-VN"/>
+        </w:rPr>
+        <w:t xml:space="preserve"> gi</w:t>
+      </w:r>
+      <w:r>
+        <w:rPr>
+          <w:lang w:val="vi-VN"/>
+        </w:rPr>
+        <w:t>á</w:t>
+      </w:r>
+      <w:r>
+        <w:rPr>
+          <w:lang w:val="vi-VN"/>
+        </w:rPr>
+        <w:t>, m</w:t>
+      </w:r>
+      <w:r>
+        <w:rPr>
+          <w:lang w:val="vi-VN"/>
+        </w:rPr>
+        <w:t>à</w:t>
+      </w:r>
+      <w:r>
+        <w:rPr>
+          <w:lang w:val="vi-VN"/>
+        </w:rPr>
+        <w:t xml:space="preserve"> c</w:t>
+      </w:r>
+      <w:r>
+        <w:rPr>
+          <w:lang w:val="vi-VN"/>
+        </w:rPr>
+        <w:t xml:space="preserve">òn </w:t>
+      </w:r>
+      <w:r>
+        <w:rPr>
+          <w:lang w:val="vi-VN"/>
+        </w:rPr>
+        <w:t>bao g</w:t>
+      </w:r>
+      <w:r>
+        <w:rPr>
+          <w:lang w:val="vi-VN"/>
+        </w:rPr>
+        <w:t xml:space="preserve">ồm </w:t>
+      </w:r>
+      <w:r>
+        <w:rPr>
+          <w:lang w:val="vi-VN"/>
+        </w:rPr>
+        <w:t>nhi</w:t>
+      </w:r>
+      <w:r>
+        <w:rPr>
+          <w:lang w:val="vi-VN"/>
+        </w:rPr>
+        <w:t>ều</w:t>
+      </w:r>
+      <w:r>
+        <w:rPr>
+          <w:lang w:val="vi-VN"/>
+        </w:rPr>
+        <w:t xml:space="preserve"> y</w:t>
+      </w:r>
+      <w:r>
+        <w:rPr>
+          <w:lang w:val="vi-VN"/>
+        </w:rPr>
+        <w:t>ếu</w:t>
+      </w:r>
+      <w:r>
+        <w:rPr>
+          <w:lang w:val="vi-VN"/>
+        </w:rPr>
+        <w:t xml:space="preserve"> t</w:t>
+      </w:r>
+      <w:r>
+        <w:rPr>
+          <w:lang w:val="vi-VN"/>
+        </w:rPr>
+        <w:t>ố</w:t>
+      </w:r>
+      <w:r>
+        <w:rPr>
+          <w:lang w:val="vi-VN"/>
+        </w:rPr>
+        <w:t xml:space="preserve"> kh</w:t>
+      </w:r>
+      <w:r>
+        <w:rPr>
+          <w:lang w:val="vi-VN"/>
+        </w:rPr>
+        <w:t>ác</w:t>
+      </w:r>
+      <w:r>
+        <w:rPr>
+          <w:lang w:val="vi-VN"/>
+        </w:rPr>
+        <w:t xml:space="preserve"> c</w:t>
+      </w:r>
+      <w:r>
+        <w:rPr>
+          <w:lang w:val="vi-VN"/>
+        </w:rPr>
+        <w:t>ó</w:t>
+      </w:r>
+      <w:r>
+        <w:rPr>
+          <w:lang w:val="vi-VN"/>
+        </w:rPr>
+        <w:t xml:space="preserve"> t</w:t>
+      </w:r>
+      <w:r>
+        <w:rPr>
+          <w:lang w:val="vi-VN"/>
+        </w:rPr>
+        <w:t>ác động</w:t>
+      </w:r>
+      <w:r>
+        <w:rPr>
+          <w:lang w:val="vi-VN"/>
+        </w:rPr>
+        <w:t xml:space="preserve"> </w:t>
+      </w:r>
+      <w:r>
+        <w:rPr>
+          <w:lang w:val="vi-VN"/>
+        </w:rPr>
+        <w:t>đến</w:t>
+      </w:r>
+      <w:r>
+        <w:rPr>
+          <w:lang w:val="vi-VN"/>
+        </w:rPr>
+        <w:t xml:space="preserve"> vi</w:t>
+      </w:r>
+      <w:r>
+        <w:rPr>
+          <w:lang w:val="vi-VN"/>
+        </w:rPr>
+        <w:t>ệ</w:t>
+      </w:r>
+      <w:r>
+        <w:rPr>
+          <w:lang w:val="vi-VN"/>
+        </w:rPr>
+        <w:t>c h</w:t>
+      </w:r>
+      <w:r>
+        <w:rPr>
+          <w:lang w:val="vi-VN"/>
+        </w:rPr>
+        <w:t>ì</w:t>
+      </w:r>
+      <w:r>
+        <w:rPr>
+          <w:lang w:val="vi-VN"/>
+        </w:rPr>
+        <w:t>nh th</w:t>
+      </w:r>
+      <w:r>
+        <w:rPr>
+          <w:lang w:val="vi-VN"/>
+        </w:rPr>
+        <w:t xml:space="preserve">ành </w:t>
+      </w:r>
+      <w:r>
+        <w:rPr>
+          <w:lang w:val="vi-VN"/>
+        </w:rPr>
+        <w:t>giá c</w:t>
+      </w:r>
+      <w:r>
+        <w:rPr>
+          <w:lang w:val="vi-VN"/>
+        </w:rPr>
+        <w:t>à</w:t>
+      </w:r>
+      <w:r>
+        <w:rPr>
+          <w:lang w:val="vi-VN"/>
+        </w:rPr>
+        <w:t xml:space="preserve"> ph</w:t>
+      </w:r>
+      <w:r>
+        <w:rPr>
+          <w:lang w:val="vi-VN"/>
+        </w:rPr>
+        <w:t>ê</w:t>
+      </w:r>
+      <w:r>
+        <w:rPr>
+          <w:lang w:val="vi-VN"/>
+        </w:rPr>
+        <w:t>. Những yếu tố này chia thành các nhóm cụ th</w:t>
+      </w:r>
+      <w:r>
+        <w:rPr>
+          <w:lang w:val="vi-VN"/>
+        </w:rPr>
+        <w:t>ể</w:t>
+      </w:r>
+      <w:r>
+        <w:rPr>
+          <w:lang w:val="vi-VN"/>
+        </w:rPr>
+        <w:t xml:space="preserve"> nh</w:t>
+      </w:r>
+      <w:r>
+        <w:rPr>
+          <w:lang w:val="vi-VN"/>
+        </w:rPr>
+        <w:t>ư</w:t>
+      </w:r>
+      <w:r>
+        <w:rPr>
+          <w:lang w:val="vi-VN"/>
+        </w:rPr>
+        <w:t>: Th</w:t>
+      </w:r>
+      <w:r>
+        <w:rPr>
+          <w:lang w:val="vi-VN"/>
+        </w:rPr>
+        <w:t>ời</w:t>
+      </w:r>
+      <w:r>
+        <w:rPr>
+          <w:lang w:val="vi-VN"/>
+        </w:rPr>
+        <w:t xml:space="preserve"> ti</w:t>
+      </w:r>
+      <w:r>
+        <w:rPr>
+          <w:lang w:val="vi-VN"/>
+        </w:rPr>
+        <w:t>ết</w:t>
+      </w:r>
+      <w:r>
+        <w:rPr>
+          <w:lang w:val="vi-VN"/>
+        </w:rPr>
+        <w:t>, t</w:t>
+      </w:r>
+      <w:r>
+        <w:rPr>
+          <w:lang w:val="vi-VN"/>
+        </w:rPr>
+        <w:t>ì</w:t>
+      </w:r>
+      <w:r>
+        <w:rPr>
+          <w:lang w:val="vi-VN"/>
+        </w:rPr>
+        <w:t>nh h</w:t>
+      </w:r>
+      <w:r>
+        <w:rPr>
+          <w:lang w:val="vi-VN"/>
+        </w:rPr>
+        <w:t>ì</w:t>
+      </w:r>
+      <w:r>
+        <w:rPr>
+          <w:lang w:val="vi-VN"/>
+        </w:rPr>
+        <w:t>nh kinh t</w:t>
+      </w:r>
+      <w:r>
+        <w:rPr>
+          <w:lang w:val="vi-VN"/>
+        </w:rPr>
+        <w:t>ế</w:t>
+      </w:r>
+      <w:r>
+        <w:rPr>
+          <w:lang w:val="vi-VN"/>
+        </w:rPr>
+        <w:t xml:space="preserve"> th</w:t>
+      </w:r>
+      <w:r>
+        <w:rPr>
+          <w:lang w:val="vi-VN"/>
+        </w:rPr>
+        <w:t>ế</w:t>
+      </w:r>
+      <w:r>
+        <w:rPr>
+          <w:lang w:val="vi-VN"/>
+        </w:rPr>
+        <w:t xml:space="preserve"> gi</w:t>
+      </w:r>
+      <w:r>
+        <w:rPr>
+          <w:lang w:val="vi-VN"/>
+        </w:rPr>
+        <w:t>ới</w:t>
+      </w:r>
+      <w:r>
+        <w:rPr>
+          <w:lang w:val="vi-VN"/>
+        </w:rPr>
+        <w:t>(t</w:t>
+      </w:r>
+      <w:r>
+        <w:rPr>
+          <w:lang w:val="vi-VN"/>
+        </w:rPr>
+        <w:t>ỷ</w:t>
+      </w:r>
+      <w:r>
+        <w:rPr>
+          <w:lang w:val="vi-VN"/>
+        </w:rPr>
+        <w:t xml:space="preserve"> giá, gi</w:t>
+      </w:r>
+      <w:r>
+        <w:rPr>
+          <w:lang w:val="vi-VN"/>
+        </w:rPr>
+        <w:t>á</w:t>
+      </w:r>
+      <w:r>
+        <w:rPr>
+          <w:lang w:val="vi-VN"/>
+        </w:rPr>
+        <w:t xml:space="preserve"> d</w:t>
+      </w:r>
+      <w:r>
+        <w:rPr>
+          <w:lang w:val="vi-VN"/>
+        </w:rPr>
+        <w:t>ầu</w:t>
+      </w:r>
+      <w:r>
+        <w:rPr>
+          <w:lang w:val="vi-VN"/>
+        </w:rPr>
+        <w:t>), s</w:t>
+      </w:r>
+      <w:r>
+        <w:rPr>
+          <w:lang w:val="vi-VN"/>
+        </w:rPr>
+        <w:t>ản</w:t>
+      </w:r>
+      <w:r>
+        <w:rPr>
+          <w:lang w:val="vi-VN"/>
+        </w:rPr>
+        <w:t xml:space="preserve"> l</w:t>
+      </w:r>
+      <w:r>
+        <w:rPr>
+          <w:lang w:val="vi-VN"/>
+        </w:rPr>
+        <w:t>ượn</w:t>
+      </w:r>
+      <w:r>
+        <w:rPr>
+          <w:lang w:val="vi-VN"/>
+        </w:rPr>
+        <w:t>g cung c</w:t>
+      </w:r>
+      <w:r>
+        <w:rPr>
+          <w:lang w:val="vi-VN"/>
+        </w:rPr>
+        <w:t>ầu</w:t>
+      </w:r>
+      <w:r>
+        <w:rPr>
+          <w:lang w:val="vi-VN"/>
+        </w:rPr>
+        <w:t xml:space="preserve"> tr</w:t>
+      </w:r>
+      <w:r>
+        <w:rPr>
+          <w:lang w:val="vi-VN"/>
+        </w:rPr>
+        <w:t>ên</w:t>
+      </w:r>
+      <w:r>
+        <w:rPr>
+          <w:lang w:val="vi-VN"/>
+        </w:rPr>
+        <w:t xml:space="preserve"> th</w:t>
+      </w:r>
+      <w:r>
+        <w:rPr>
+          <w:lang w:val="vi-VN"/>
+        </w:rPr>
+        <w:t xml:space="preserve">ế </w:t>
+      </w:r>
+      <w:r>
+        <w:rPr>
+          <w:lang w:val="vi-VN"/>
+        </w:rPr>
+        <w:t>gi</w:t>
+      </w:r>
+      <w:r>
+        <w:rPr>
+          <w:lang w:val="vi-VN"/>
+        </w:rPr>
+        <w:t>ới</w:t>
+      </w:r>
+      <w:r>
+        <w:rPr>
+          <w:lang w:val="vi-VN"/>
+        </w:rPr>
+        <w:t>. Việc kết hợp nhiều nguồn thông tin như vậy gi</w:t>
+      </w:r>
+      <w:r>
+        <w:rPr>
+          <w:lang w:val="vi-VN"/>
+        </w:rPr>
+        <w:t>úp</w:t>
+      </w:r>
+      <w:r>
+        <w:rPr>
+          <w:lang w:val="vi-VN"/>
+        </w:rPr>
+        <w:t xml:space="preserve"> m</w:t>
+      </w:r>
+      <w:r>
+        <w:rPr>
+          <w:lang w:val="vi-VN"/>
+        </w:rPr>
+        <w:t>ô</w:t>
+      </w:r>
+      <w:r>
+        <w:rPr>
+          <w:lang w:val="vi-VN"/>
+        </w:rPr>
+        <w:t xml:space="preserve"> h</w:t>
+      </w:r>
+      <w:r>
+        <w:rPr>
+          <w:lang w:val="vi-VN"/>
+        </w:rPr>
+        <w:t>ì</w:t>
+      </w:r>
+      <w:r>
+        <w:rPr>
+          <w:lang w:val="vi-VN"/>
+        </w:rPr>
+        <w:t>nh d</w:t>
+      </w:r>
+      <w:r>
+        <w:rPr>
+          <w:lang w:val="vi-VN"/>
+        </w:rPr>
+        <w:t>ự</w:t>
+      </w:r>
+      <w:r>
+        <w:rPr>
+          <w:lang w:val="vi-VN"/>
+        </w:rPr>
+        <w:t xml:space="preserve"> b</w:t>
+      </w:r>
+      <w:r>
+        <w:rPr>
+          <w:lang w:val="vi-VN"/>
+        </w:rPr>
+        <w:t>áo</w:t>
+      </w:r>
+      <w:r>
+        <w:rPr>
+          <w:lang w:val="vi-VN"/>
+        </w:rPr>
+        <w:t xml:space="preserve"> c</w:t>
+      </w:r>
+      <w:r>
+        <w:rPr>
+          <w:lang w:val="vi-VN"/>
+        </w:rPr>
+        <w:t>ó</w:t>
+      </w:r>
+      <w:r>
+        <w:rPr>
+          <w:lang w:val="vi-VN"/>
+        </w:rPr>
+        <w:t xml:space="preserve"> c</w:t>
+      </w:r>
+      <w:r>
+        <w:rPr>
+          <w:lang w:val="vi-VN"/>
+        </w:rPr>
+        <w:t>ái</w:t>
+      </w:r>
+      <w:r>
+        <w:rPr>
+          <w:lang w:val="vi-VN"/>
+        </w:rPr>
+        <w:t xml:space="preserve"> nh</w:t>
+      </w:r>
+      <w:r>
+        <w:rPr>
+          <w:lang w:val="vi-VN"/>
+        </w:rPr>
+        <w:t>ìn đầ</w:t>
+      </w:r>
+      <w:r>
+        <w:rPr>
+          <w:lang w:val="vi-VN"/>
+        </w:rPr>
+        <w:t xml:space="preserve">y </w:t>
+      </w:r>
+      <w:r>
+        <w:rPr>
+          <w:lang w:val="vi-VN"/>
+        </w:rPr>
+        <w:t>đủ</w:t>
+      </w:r>
+      <w:r>
+        <w:rPr>
+          <w:lang w:val="vi-VN"/>
+        </w:rPr>
+        <w:t xml:space="preserve"> h</w:t>
+      </w:r>
+      <w:r>
+        <w:rPr>
+          <w:lang w:val="vi-VN"/>
+        </w:rPr>
+        <w:t>ơ</w:t>
+      </w:r>
+      <w:r>
+        <w:rPr>
+          <w:lang w:val="vi-VN"/>
+        </w:rPr>
+        <w:t>n, hi</w:t>
+      </w:r>
+      <w:r>
+        <w:rPr>
+          <w:lang w:val="vi-VN"/>
+        </w:rPr>
+        <w:t>ểu</w:t>
+      </w:r>
+      <w:r>
+        <w:rPr>
+          <w:lang w:val="vi-VN"/>
+        </w:rPr>
+        <w:t xml:space="preserve"> </w:t>
+      </w:r>
+      <w:r>
+        <w:rPr>
+          <w:lang w:val="vi-VN"/>
+        </w:rPr>
+        <w:t>đượ</w:t>
+      </w:r>
+      <w:r>
+        <w:rPr>
+          <w:lang w:val="vi-VN"/>
+        </w:rPr>
+        <w:t>c c</w:t>
+      </w:r>
+      <w:r>
+        <w:rPr>
+          <w:lang w:val="vi-VN"/>
+        </w:rPr>
+        <w:t>ác</w:t>
+      </w:r>
+      <w:r>
+        <w:rPr>
+          <w:lang w:val="vi-VN"/>
+        </w:rPr>
+        <w:t xml:space="preserve"> </w:t>
+      </w:r>
+      <w:r>
+        <w:rPr>
+          <w:lang w:val="vi-VN"/>
+        </w:rPr>
+        <w:t>đợ</w:t>
+      </w:r>
+      <w:r>
+        <w:rPr>
+          <w:lang w:val="vi-VN"/>
+        </w:rPr>
+        <w:t>t bi</w:t>
+      </w:r>
+      <w:r>
+        <w:rPr>
+          <w:lang w:val="vi-VN"/>
+        </w:rPr>
+        <w:t>ến động</w:t>
+      </w:r>
+      <w:r>
+        <w:rPr>
+          <w:lang w:val="vi-VN"/>
+        </w:rPr>
+        <w:t xml:space="preserve"> gi</w:t>
+      </w:r>
+      <w:r>
+        <w:rPr>
+          <w:lang w:val="vi-VN"/>
+        </w:rPr>
+        <w:t>á</w:t>
+      </w:r>
+      <w:r>
+        <w:rPr>
+          <w:lang w:val="vi-VN"/>
+        </w:rPr>
+        <w:t xml:space="preserve"> </w:t>
+      </w:r>
+      <w:r>
+        <w:rPr>
+          <w:lang w:val="vi-VN"/>
+        </w:rPr>
+        <w:t xml:space="preserve">đến </w:t>
+      </w:r>
+      <w:r>
+        <w:rPr>
+          <w:lang w:val="vi-VN"/>
+        </w:rPr>
+        <w:t>t</w:t>
+      </w:r>
+      <w:r>
+        <w:rPr>
+          <w:lang w:val="vi-VN"/>
+        </w:rPr>
+        <w:t>ừ</w:t>
+      </w:r>
+      <w:r>
+        <w:rPr>
+          <w:lang w:val="vi-VN"/>
+        </w:rPr>
+        <w:t xml:space="preserve"> </w:t>
+      </w:r>
+      <w:r>
+        <w:rPr>
+          <w:lang w:val="vi-VN"/>
+        </w:rPr>
+        <w:t>đâ</w:t>
+      </w:r>
+      <w:r>
+        <w:rPr>
+          <w:lang w:val="vi-VN"/>
+        </w:rPr>
+        <w:t>u thay v</w:t>
+      </w:r>
+      <w:r>
+        <w:rPr>
+          <w:lang w:val="vi-VN"/>
+        </w:rPr>
+        <w:t>ì</w:t>
+      </w:r>
+      <w:r>
+        <w:rPr>
+          <w:lang w:val="vi-VN"/>
+        </w:rPr>
+        <w:t xml:space="preserve"> ch</w:t>
+      </w:r>
+      <w:r>
+        <w:rPr>
+          <w:lang w:val="vi-VN"/>
+        </w:rPr>
+        <w:t>ỉ</w:t>
+      </w:r>
+      <w:r>
+        <w:rPr>
+          <w:lang w:val="vi-VN"/>
+        </w:rPr>
+        <w:t xml:space="preserve"> nh</w:t>
+      </w:r>
+      <w:r>
+        <w:rPr>
+          <w:lang w:val="vi-VN"/>
+        </w:rPr>
+        <w:t>ìn</w:t>
+      </w:r>
+      <w:r>
+        <w:rPr>
+          <w:lang w:val="vi-VN"/>
+        </w:rPr>
+        <w:t xml:space="preserve"> v</w:t>
+      </w:r>
+      <w:r>
+        <w:rPr>
+          <w:lang w:val="vi-VN"/>
+        </w:rPr>
+        <w:t>ào</w:t>
+      </w:r>
+      <w:r>
+        <w:rPr>
+          <w:lang w:val="vi-VN"/>
+        </w:rPr>
+        <w:t xml:space="preserve"> gi</w:t>
+      </w:r>
+      <w:r>
+        <w:rPr>
+          <w:lang w:val="vi-VN"/>
+        </w:rPr>
+        <w:t>á</w:t>
+      </w:r>
+      <w:r>
+        <w:rPr>
+          <w:lang w:val="vi-VN"/>
+        </w:rPr>
+        <w:t xml:space="preserve"> trong quá kh</w:t>
+      </w:r>
+      <w:r>
+        <w:rPr>
+          <w:lang w:val="vi-VN"/>
+        </w:rPr>
+        <w:t>ứ</w:t>
+      </w:r>
+      <w:r>
+        <w:rPr>
+          <w:lang w:val="vi-VN"/>
+        </w:rPr>
+        <w:t>.</w:t>
+      </w:r>
+    </w:p>
+    <w:p>
+      <w:pPr>
+        <w:rPr>
+          <w:lang w:val="vi-VN"/>
+        </w:rPr>
+      </w:pPr>
+      <w:r>
+        <w:rPr>
+          <w:lang w:val="vi-VN"/>
+        </w:rPr>
+        <w:t>Ban đầu, ở dạng d</w:t>
+      </w:r>
+      <w:r>
+        <w:rPr>
+          <w:lang w:val="vi-VN"/>
+        </w:rPr>
+        <w:t>ữ</w:t>
+      </w:r>
+      <w:r>
+        <w:rPr>
+          <w:lang w:val="vi-VN"/>
+        </w:rPr>
+        <w:t xml:space="preserve"> li</w:t>
+      </w:r>
+      <w:r>
+        <w:rPr>
+          <w:lang w:val="vi-VN"/>
+        </w:rPr>
+        <w:t>ệu</w:t>
+      </w:r>
+      <w:r>
+        <w:rPr>
+          <w:lang w:val="vi-VN"/>
+        </w:rPr>
+        <w:t xml:space="preserve"> th</w:t>
+      </w:r>
+      <w:r>
+        <w:rPr>
+          <w:lang w:val="vi-VN"/>
+        </w:rPr>
+        <w:t>ô</w:t>
+      </w:r>
+      <w:r>
+        <w:rPr>
+          <w:lang w:val="vi-VN"/>
+        </w:rPr>
+        <w:t xml:space="preserve"> d</w:t>
+      </w:r>
+      <w:r>
+        <w:rPr>
+          <w:lang w:val="vi-VN"/>
+        </w:rPr>
+        <w:t>ữ</w:t>
+      </w:r>
+      <w:r>
+        <w:rPr>
+          <w:lang w:val="vi-VN"/>
+        </w:rPr>
+        <w:t xml:space="preserve"> li</w:t>
+      </w:r>
+      <w:r>
+        <w:rPr>
+          <w:lang w:val="vi-VN"/>
+        </w:rPr>
+        <w:t>ệu</w:t>
+      </w:r>
+      <w:r>
+        <w:rPr>
+          <w:lang w:val="vi-VN"/>
+        </w:rPr>
+        <w:t xml:space="preserve"> thu th</w:t>
+      </w:r>
+      <w:r>
+        <w:rPr>
+          <w:lang w:val="vi-VN"/>
+        </w:rPr>
+        <w:t>ập đượ</w:t>
+      </w:r>
+      <w:r>
+        <w:rPr>
+          <w:lang w:val="vi-VN"/>
+        </w:rPr>
+        <w:t>c 12 t</w:t>
+      </w:r>
+      <w:r>
+        <w:rPr>
+          <w:lang w:val="vi-VN"/>
+        </w:rPr>
+        <w:t>ỉ</w:t>
+      </w:r>
+      <w:r>
+        <w:rPr>
+          <w:lang w:val="vi-VN"/>
+        </w:rPr>
+        <w:t>nh th</w:t>
+      </w:r>
+      <w:r>
+        <w:rPr>
+          <w:lang w:val="vi-VN"/>
+        </w:rPr>
+        <w:t>ành</w:t>
+      </w:r>
+      <w:r>
+        <w:rPr>
+          <w:lang w:val="vi-VN"/>
+        </w:rPr>
+        <w:t xml:space="preserve"> v</w:t>
+      </w:r>
+      <w:r>
+        <w:rPr>
+          <w:lang w:val="vi-VN"/>
+        </w:rPr>
+        <w:t>ới</w:t>
+      </w:r>
+      <w:r>
+        <w:rPr>
+          <w:lang w:val="vi-VN"/>
+        </w:rPr>
+        <w:t xml:space="preserve"> t</w:t>
+      </w:r>
+      <w:r>
+        <w:rPr>
+          <w:lang w:val="vi-VN"/>
+        </w:rPr>
+        <w:t xml:space="preserve">ổng </w:t>
+      </w:r>
+      <w:r>
+        <w:rPr>
+          <w:lang w:val="vi-VN"/>
+        </w:rPr>
+        <w:t>c</w:t>
+      </w:r>
+      <w:r>
+        <w:rPr>
+          <w:lang w:val="vi-VN"/>
+        </w:rPr>
+        <w:t>ộng</w:t>
+      </w:r>
+      <w:r>
+        <w:rPr>
+          <w:lang w:val="vi-VN"/>
+        </w:rPr>
+        <w:t xml:space="preserve"> </w:t>
+      </w:r>
+      <w:r>
+        <w:rPr>
+          <w:lang w:val="vi-VN"/>
+        </w:rPr>
+        <w:t>kho</w:t>
+      </w:r>
+      <w:r>
+        <w:rPr>
+          <w:lang w:val="vi-VN"/>
+        </w:rPr>
+        <w:t>ảng</w:t>
+      </w:r>
+      <w:r>
+        <w:rPr>
+          <w:lang w:val="vi-VN"/>
+        </w:rPr>
+        <w:t xml:space="preserve"> </w:t>
+      </w:r>
+      <w:r>
+        <w:rPr>
+          <w:lang w:val="vi-VN"/>
+        </w:rPr>
+        <w:t>72.000 quan s</w:t>
+      </w:r>
+      <w:r>
+        <w:rPr>
+          <w:lang w:val="vi-VN"/>
+        </w:rPr>
+        <w:t>át</w:t>
+      </w:r>
+      <w:r>
+        <w:rPr>
+          <w:lang w:val="vi-VN"/>
+        </w:rPr>
+        <w:t xml:space="preserve"> (6.046 ng</w:t>
+      </w:r>
+      <w:r>
+        <w:rPr>
+          <w:lang w:val="vi-VN"/>
+        </w:rPr>
+        <w:t>ày</w:t>
+      </w:r>
+      <w:r>
+        <w:rPr>
+          <w:lang w:val="vi-VN"/>
+        </w:rPr>
+        <w:t>/ m</w:t>
+      </w:r>
+      <w:r>
+        <w:rPr>
+          <w:lang w:val="vi-VN"/>
+        </w:rPr>
+        <w:t>ỗi</w:t>
+      </w:r>
+      <w:r>
+        <w:rPr>
+          <w:lang w:val="vi-VN"/>
+        </w:rPr>
+        <w:t xml:space="preserve"> t</w:t>
+      </w:r>
+      <w:r>
+        <w:rPr>
+          <w:lang w:val="vi-VN"/>
+        </w:rPr>
+        <w:t>ỉnh</w:t>
+      </w:r>
+      <w:r>
+        <w:rPr>
+          <w:lang w:val="vi-VN"/>
+        </w:rPr>
+        <w:t>)</w:t>
+      </w:r>
+      <w:r>
+        <w:rPr>
+          <w:lang w:val="vi-VN"/>
+        </w:rPr>
+        <w:t>. Tuy nhiên, sau bước kiểm tra và loại bỏ nh</w:t>
+      </w:r>
+      <w:r>
+        <w:rPr>
+          <w:lang w:val="vi-VN"/>
+        </w:rPr>
+        <w:t>ững</w:t>
+      </w:r>
+      <w:r>
+        <w:rPr>
+          <w:lang w:val="vi-VN"/>
+        </w:rPr>
+        <w:t xml:space="preserve"> d</w:t>
+      </w:r>
+      <w:r>
+        <w:rPr>
+          <w:lang w:val="vi-VN"/>
+        </w:rPr>
+        <w:t>ữ</w:t>
+      </w:r>
+      <w:r>
+        <w:rPr>
+          <w:lang w:val="vi-VN"/>
+        </w:rPr>
+        <w:t xml:space="preserve"> li</w:t>
+      </w:r>
+      <w:r>
+        <w:rPr>
+          <w:lang w:val="vi-VN"/>
+        </w:rPr>
+        <w:t>ệu</w:t>
+      </w:r>
+      <w:r>
+        <w:rPr>
+          <w:lang w:val="vi-VN"/>
+        </w:rPr>
+        <w:t xml:space="preserve"> kh</w:t>
+      </w:r>
+      <w:r>
+        <w:rPr>
+          <w:lang w:val="vi-VN"/>
+        </w:rPr>
+        <w:t>ô</w:t>
+      </w:r>
+      <w:r>
+        <w:rPr>
+          <w:lang w:val="vi-VN"/>
+        </w:rPr>
+        <w:t>ng ch</w:t>
+      </w:r>
+      <w:r>
+        <w:rPr>
+          <w:lang w:val="vi-VN"/>
+        </w:rPr>
+        <w:t>í</w:t>
+      </w:r>
+      <w:r>
+        <w:rPr>
+          <w:lang w:val="vi-VN"/>
+        </w:rPr>
+        <w:t>nh x</w:t>
+      </w:r>
+      <w:r>
+        <w:rPr>
+          <w:lang w:val="vi-VN"/>
+        </w:rPr>
+        <w:t>ác</w:t>
+      </w:r>
+      <w:r>
+        <w:rPr>
+          <w:lang w:val="vi-VN"/>
+        </w:rPr>
+        <w:t xml:space="preserve"> do s</w:t>
+      </w:r>
+      <w:r>
+        <w:rPr>
+          <w:lang w:val="vi-VN"/>
+        </w:rPr>
+        <w:t>ự</w:t>
+      </w:r>
+      <w:r>
+        <w:rPr>
+          <w:lang w:val="vi-VN"/>
+        </w:rPr>
+        <w:t xml:space="preserve"> ch</w:t>
+      </w:r>
+      <w:r>
+        <w:rPr>
+          <w:lang w:val="vi-VN"/>
+        </w:rPr>
+        <w:t>ên</w:t>
+      </w:r>
+      <w:r>
+        <w:rPr>
+          <w:lang w:val="vi-VN"/>
+        </w:rPr>
+        <w:t>h l</w:t>
+      </w:r>
+      <w:r>
+        <w:rPr>
+          <w:lang w:val="vi-VN"/>
+        </w:rPr>
+        <w:t xml:space="preserve">ệch </w:t>
+      </w:r>
+      <w:r>
+        <w:rPr>
+          <w:lang w:val="vi-VN"/>
+        </w:rPr>
+        <w:t>v</w:t>
+      </w:r>
+      <w:r>
+        <w:rPr>
+          <w:lang w:val="vi-VN"/>
+        </w:rPr>
+        <w:t>ề</w:t>
+      </w:r>
+      <w:r>
+        <w:rPr>
+          <w:lang w:val="vi-VN"/>
+        </w:rPr>
+        <w:t xml:space="preserve"> m</w:t>
+      </w:r>
+      <w:r>
+        <w:rPr>
+          <w:lang w:val="vi-VN"/>
+        </w:rPr>
+        <w:t>ức</w:t>
+      </w:r>
+      <w:r>
+        <w:rPr>
+          <w:lang w:val="vi-VN"/>
+        </w:rPr>
+        <w:t xml:space="preserve"> giá thu th</w:t>
+      </w:r>
+      <w:r>
+        <w:rPr>
+          <w:lang w:val="vi-VN"/>
+        </w:rPr>
+        <w:t>ập</w:t>
+      </w:r>
+      <w:r>
+        <w:rPr>
+          <w:lang w:val="vi-VN"/>
+        </w:rPr>
+        <w:t xml:space="preserve"> </w:t>
+      </w:r>
+      <w:r>
+        <w:rPr>
+          <w:lang w:val="vi-VN"/>
+        </w:rPr>
+        <w:t>đượ</w:t>
+      </w:r>
+      <w:r>
+        <w:rPr>
+          <w:lang w:val="vi-VN"/>
+        </w:rPr>
+        <w:t>c qu</w:t>
+      </w:r>
+      <w:r>
+        <w:rPr>
+          <w:lang w:val="vi-VN"/>
+        </w:rPr>
+        <w:t>á</w:t>
+      </w:r>
+      <w:r>
+        <w:rPr>
+          <w:lang w:val="vi-VN"/>
+        </w:rPr>
+        <w:t xml:space="preserve"> l</w:t>
+      </w:r>
+      <w:r>
+        <w:rPr>
+          <w:lang w:val="vi-VN"/>
+        </w:rPr>
+        <w:t>ớn</w:t>
+      </w:r>
+      <w:r>
+        <w:rPr>
+          <w:lang w:val="vi-VN"/>
+        </w:rPr>
+        <w:t>, t</w:t>
+      </w:r>
+      <w:r>
+        <w:rPr>
+          <w:lang w:val="vi-VN"/>
+        </w:rPr>
+        <w:t>ập</w:t>
+      </w:r>
+      <w:r>
+        <w:rPr>
+          <w:lang w:val="vi-VN"/>
+        </w:rPr>
+        <w:t xml:space="preserve"> d</w:t>
+      </w:r>
+      <w:r>
+        <w:rPr>
+          <w:lang w:val="vi-VN"/>
+        </w:rPr>
+        <w:t>ữ</w:t>
+      </w:r>
+      <w:r>
+        <w:rPr>
+          <w:lang w:val="vi-VN"/>
+        </w:rPr>
+        <w:t xml:space="preserve"> li</w:t>
+      </w:r>
+      <w:r>
+        <w:rPr>
+          <w:lang w:val="vi-VN"/>
+        </w:rPr>
+        <w:t>ệu</w:t>
+      </w:r>
+      <w:r>
+        <w:rPr>
+          <w:lang w:val="vi-VN"/>
+        </w:rPr>
+        <w:t xml:space="preserve"> ch</w:t>
+      </w:r>
+      <w:r>
+        <w:rPr>
+          <w:lang w:val="vi-VN"/>
+        </w:rPr>
+        <w:t>í</w:t>
+      </w:r>
+      <w:r>
+        <w:rPr>
+          <w:lang w:val="vi-VN"/>
+        </w:rPr>
+        <w:t>nh th</w:t>
+      </w:r>
+      <w:r>
+        <w:rPr>
+          <w:lang w:val="vi-VN"/>
+        </w:rPr>
+        <w:t>ức</w:t>
+      </w:r>
+      <w:r>
+        <w:rPr>
+          <w:lang w:val="vi-VN"/>
+        </w:rPr>
+        <w:t xml:space="preserve"> </w:t>
+      </w:r>
+      <w:r>
+        <w:rPr>
+          <w:lang w:val="vi-VN"/>
+        </w:rPr>
+        <w:t>đượ</w:t>
+      </w:r>
+      <w:r>
+        <w:rPr>
+          <w:lang w:val="vi-VN"/>
+        </w:rPr>
+        <w:t xml:space="preserve">c </w:t>
+      </w:r>
+      <w:r>
+        <w:rPr>
+          <w:lang w:val="vi-VN"/>
+        </w:rPr>
+        <w:t>đư</w:t>
+      </w:r>
+      <w:r>
+        <w:rPr>
+          <w:lang w:val="vi-VN"/>
+        </w:rPr>
+        <w:t>a v</w:t>
+      </w:r>
+      <w:r>
+        <w:rPr>
+          <w:lang w:val="vi-VN"/>
+        </w:rPr>
+        <w:t>ào</w:t>
+      </w:r>
+      <w:r>
+        <w:rPr>
+          <w:lang w:val="vi-VN"/>
+        </w:rPr>
+        <w:t xml:space="preserve"> m</w:t>
+      </w:r>
+      <w:r>
+        <w:rPr>
+          <w:lang w:val="vi-VN"/>
+        </w:rPr>
+        <w:t>ô</w:t>
+      </w:r>
+      <w:r>
+        <w:rPr>
+          <w:lang w:val="vi-VN"/>
+        </w:rPr>
+        <w:t xml:space="preserve"> h</w:t>
+      </w:r>
+      <w:r>
+        <w:rPr>
+          <w:lang w:val="vi-VN"/>
+        </w:rPr>
+        <w:t>ì</w:t>
+      </w:r>
+      <w:r>
+        <w:rPr>
+          <w:lang w:val="vi-VN"/>
+        </w:rPr>
+        <w:t>nh chỉ gi</w:t>
+      </w:r>
+      <w:r>
+        <w:rPr>
+          <w:lang w:val="vi-VN"/>
+        </w:rPr>
+        <w:t>ữ</w:t>
+      </w:r>
+      <w:r>
+        <w:rPr>
+          <w:lang w:val="vi-VN"/>
+        </w:rPr>
+        <w:t xml:space="preserve"> l</w:t>
+      </w:r>
+      <w:r>
+        <w:rPr>
+          <w:lang w:val="vi-VN"/>
+        </w:rPr>
+        <w:t>ại</w:t>
+      </w:r>
+      <w:r>
+        <w:rPr>
+          <w:lang w:val="vi-VN"/>
+        </w:rPr>
+        <w:t xml:space="preserve"> 9 t</w:t>
+      </w:r>
+      <w:r>
+        <w:rPr>
+          <w:lang w:val="vi-VN"/>
+        </w:rPr>
+        <w:t>ỉ</w:t>
+      </w:r>
+      <w:r>
+        <w:rPr>
+          <w:lang w:val="vi-VN"/>
+        </w:rPr>
+        <w:t>nh th</w:t>
+      </w:r>
+      <w:r>
+        <w:rPr>
+          <w:lang w:val="vi-VN"/>
+        </w:rPr>
+        <w:t>ành</w:t>
+      </w:r>
+      <w:r>
+        <w:rPr>
+          <w:lang w:val="vi-VN"/>
+        </w:rPr>
+        <w:t xml:space="preserve"> v</w:t>
+      </w:r>
+      <w:r>
+        <w:rPr>
+          <w:lang w:val="vi-VN"/>
+        </w:rPr>
+        <w:t>ới</w:t>
+      </w:r>
+      <w:r>
+        <w:rPr>
+          <w:lang w:val="vi-VN"/>
+        </w:rPr>
+        <w:t xml:space="preserve"> kho</w:t>
+      </w:r>
+      <w:r>
+        <w:rPr>
+          <w:lang w:val="vi-VN"/>
+        </w:rPr>
+        <w:t>ảng</w:t>
+      </w:r>
+      <w:r>
+        <w:rPr>
+          <w:lang w:val="vi-VN"/>
+        </w:rPr>
+        <w:t xml:space="preserve"> 54.000 quan s</w:t>
+      </w:r>
+      <w:r>
+        <w:rPr>
+          <w:lang w:val="vi-VN"/>
+        </w:rPr>
+        <w:t>át</w:t>
+      </w:r>
+      <w:r>
+        <w:rPr>
+          <w:lang w:val="vi-VN"/>
+        </w:rPr>
+        <w:t>. Gồm 5 tỉnh Tây Nguyên (Dak lak, Dak Nông, Gia Lai, Kon Tum, L</w:t>
+      </w:r>
+      <w:r>
+        <w:rPr>
+          <w:lang w:val="vi-VN"/>
+        </w:rPr>
+        <w:t>â</w:t>
+      </w:r>
+      <w:r>
+        <w:rPr>
+          <w:lang w:val="vi-VN"/>
+        </w:rPr>
+        <w:t xml:space="preserve">m </w:t>
+      </w:r>
+      <w:r>
+        <w:rPr>
+          <w:lang w:val="vi-VN"/>
+        </w:rPr>
+        <w:t>Đồng</w:t>
+      </w:r>
+      <w:r>
+        <w:rPr>
+          <w:lang w:val="vi-VN"/>
+        </w:rPr>
+        <w:t>) v</w:t>
+      </w:r>
+      <w:r>
+        <w:rPr>
+          <w:lang w:val="vi-VN"/>
+        </w:rPr>
+        <w:t>à</w:t>
+      </w:r>
+      <w:r>
+        <w:rPr>
+          <w:lang w:val="vi-VN"/>
+        </w:rPr>
+        <w:t xml:space="preserve"> 4 t</w:t>
+      </w:r>
+      <w:r>
+        <w:rPr>
+          <w:lang w:val="vi-VN"/>
+        </w:rPr>
+        <w:t>ỉnh Đô</w:t>
+      </w:r>
+      <w:r>
+        <w:rPr>
+          <w:lang w:val="vi-VN"/>
+        </w:rPr>
+        <w:t>ng Nam B</w:t>
+      </w:r>
+      <w:r>
+        <w:rPr>
+          <w:lang w:val="vi-VN"/>
+        </w:rPr>
+        <w:t>ộ</w:t>
+      </w:r>
+      <w:r>
+        <w:rPr>
+          <w:lang w:val="vi-VN"/>
+        </w:rPr>
+        <w:t xml:space="preserve"> - B</w:t>
+      </w:r>
+      <w:r>
+        <w:rPr>
+          <w:lang w:val="vi-VN"/>
+        </w:rPr>
+        <w:t>ắc</w:t>
+      </w:r>
+      <w:r>
+        <w:rPr>
+          <w:lang w:val="vi-VN"/>
+        </w:rPr>
+        <w:t xml:space="preserve"> Trung B</w:t>
+      </w:r>
+      <w:r>
+        <w:rPr>
+          <w:lang w:val="vi-VN"/>
+        </w:rPr>
+        <w:t>ộ</w:t>
+      </w:r>
+      <w:r>
+        <w:rPr>
+          <w:lang w:val="vi-VN"/>
+        </w:rPr>
+        <w:t xml:space="preserve"> (B</w:t>
+      </w:r>
+      <w:r>
+        <w:rPr>
+          <w:lang w:val="vi-VN"/>
+        </w:rPr>
+        <w:t>à</w:t>
+      </w:r>
+      <w:r>
+        <w:rPr>
+          <w:lang w:val="vi-VN"/>
+        </w:rPr>
+        <w:t xml:space="preserve"> R</w:t>
+      </w:r>
+      <w:r>
+        <w:rPr>
+          <w:lang w:val="vi-VN"/>
+        </w:rPr>
+        <w:t>ịa</w:t>
+      </w:r>
+      <w:r>
+        <w:rPr>
+          <w:lang w:val="vi-VN"/>
+        </w:rPr>
+        <w:t xml:space="preserve"> </w:t>
+      </w:r>
+      <w:r>
+        <w:rPr>
+          <w:lang w:val="vi-VN"/>
+        </w:rPr>
+        <w:t>–</w:t>
+      </w:r>
+      <w:r>
+        <w:rPr>
+          <w:lang w:val="vi-VN"/>
+        </w:rPr>
+        <w:t xml:space="preserve"> V</w:t>
+      </w:r>
+      <w:r>
+        <w:rPr>
+          <w:lang w:val="vi-VN"/>
+        </w:rPr>
+        <w:t>ũng</w:t>
+      </w:r>
+      <w:r>
+        <w:rPr>
+          <w:lang w:val="vi-VN"/>
+        </w:rPr>
+        <w:t xml:space="preserve"> T</w:t>
+      </w:r>
+      <w:r>
+        <w:rPr>
+          <w:lang w:val="vi-VN"/>
+        </w:rPr>
+        <w:t>àu</w:t>
+      </w:r>
+      <w:r>
+        <w:rPr>
+          <w:lang w:val="vi-VN"/>
+        </w:rPr>
+        <w:t>, B</w:t>
+      </w:r>
+      <w:r>
+        <w:rPr>
+          <w:lang w:val="vi-VN"/>
+        </w:rPr>
+        <w:t xml:space="preserve">ình </w:t>
+      </w:r>
+      <w:r>
+        <w:rPr>
+          <w:lang w:val="vi-VN"/>
+        </w:rPr>
+        <w:t>Ph</w:t>
+      </w:r>
+      <w:r>
+        <w:rPr>
+          <w:lang w:val="vi-VN"/>
+        </w:rPr>
+        <w:t>ước</w:t>
+      </w:r>
+      <w:r>
+        <w:rPr>
+          <w:lang w:val="vi-VN"/>
+        </w:rPr>
+        <w:t xml:space="preserve">, </w:t>
+      </w:r>
+      <w:r>
+        <w:rPr>
+          <w:lang w:val="vi-VN"/>
+        </w:rPr>
+        <w:t xml:space="preserve">Đồng </w:t>
+      </w:r>
+      <w:r>
+        <w:rPr>
+          <w:lang w:val="vi-VN"/>
+        </w:rPr>
+        <w:t>Nai, Ngh</w:t>
+      </w:r>
+      <w:r>
+        <w:rPr>
+          <w:lang w:val="vi-VN"/>
+        </w:rPr>
+        <w:t>ệ</w:t>
+      </w:r>
+      <w:r>
+        <w:rPr>
+          <w:lang w:val="vi-VN"/>
+        </w:rPr>
+        <w:t xml:space="preserve"> An). Tập dữ liệu được thu thập trong quá kh</w:t>
+      </w:r>
+      <w:r>
+        <w:rPr>
+          <w:lang w:val="vi-VN"/>
+        </w:rPr>
+        <w:t>ứ</w:t>
+      </w:r>
+      <w:r>
+        <w:rPr>
+          <w:lang w:val="vi-VN"/>
+        </w:rPr>
+        <w:t xml:space="preserve"> n</w:t>
+      </w:r>
+      <w:r>
+        <w:rPr>
+          <w:lang w:val="vi-VN"/>
+        </w:rPr>
+        <w:t>ên</w:t>
+      </w:r>
+      <w:r>
+        <w:rPr>
+          <w:lang w:val="vi-VN"/>
+        </w:rPr>
+        <w:t xml:space="preserve"> s</w:t>
+      </w:r>
+      <w:r>
+        <w:rPr>
+          <w:lang w:val="vi-VN"/>
+        </w:rPr>
+        <w:t>ẽ</w:t>
+      </w:r>
+      <w:r>
+        <w:rPr>
+          <w:lang w:val="vi-VN"/>
+        </w:rPr>
+        <w:t xml:space="preserve"> gi</w:t>
+      </w:r>
+      <w:r>
+        <w:rPr>
+          <w:lang w:val="vi-VN"/>
+        </w:rPr>
+        <w:t>ữ</w:t>
+      </w:r>
+      <w:r>
+        <w:rPr>
+          <w:lang w:val="vi-VN"/>
+        </w:rPr>
+        <w:t xml:space="preserve"> nguy</w:t>
+      </w:r>
+      <w:r>
+        <w:rPr>
+          <w:lang w:val="vi-VN"/>
+        </w:rPr>
+        <w:t>ê</w:t>
+      </w:r>
+      <w:r>
+        <w:rPr>
+          <w:lang w:val="vi-VN"/>
+        </w:rPr>
+        <w:t>n t</w:t>
+      </w:r>
+      <w:r>
+        <w:rPr>
+          <w:lang w:val="vi-VN"/>
+        </w:rPr>
+        <w:t xml:space="preserve">ên </w:t>
+      </w:r>
+      <w:r>
+        <w:rPr>
+          <w:lang w:val="vi-VN"/>
+        </w:rPr>
+        <w:t>c</w:t>
+      </w:r>
+      <w:r>
+        <w:rPr>
+          <w:lang w:val="vi-VN"/>
+        </w:rPr>
+        <w:t>ác</w:t>
+      </w:r>
+      <w:r>
+        <w:rPr>
+          <w:lang w:val="vi-VN"/>
+        </w:rPr>
+        <w:t xml:space="preserve"> t</w:t>
+      </w:r>
+      <w:r>
+        <w:rPr>
+          <w:lang w:val="vi-VN"/>
+        </w:rPr>
+        <w:t xml:space="preserve">ỉnh </w:t>
+      </w:r>
+      <w:r>
+        <w:rPr>
+          <w:lang w:val="vi-VN"/>
+        </w:rPr>
+        <w:t>th</w:t>
+      </w:r>
+      <w:r>
+        <w:rPr>
+          <w:lang w:val="vi-VN"/>
+        </w:rPr>
+        <w:t>ành ở</w:t>
+      </w:r>
+      <w:r>
+        <w:rPr>
+          <w:lang w:val="vi-VN"/>
+        </w:rPr>
+        <w:t xml:space="preserve"> trong qu</w:t>
+      </w:r>
+      <w:r>
+        <w:rPr>
+          <w:lang w:val="vi-VN"/>
+        </w:rPr>
+        <w:t>á</w:t>
+      </w:r>
+      <w:r>
+        <w:rPr>
+          <w:lang w:val="vi-VN"/>
+        </w:rPr>
+        <w:t xml:space="preserve"> kh</w:t>
+      </w:r>
+      <w:r>
+        <w:rPr>
+          <w:lang w:val="vi-VN"/>
+        </w:rPr>
+        <w:t>ứ</w:t>
+      </w:r>
+      <w:r>
+        <w:rPr>
+          <w:lang w:val="vi-VN"/>
+        </w:rPr>
+        <w:t>, ch</w:t>
+      </w:r>
+      <w:r>
+        <w:rPr>
+          <w:lang w:val="vi-VN"/>
+        </w:rPr>
+        <w:t>ư</w:t>
+      </w:r>
+      <w:r>
+        <w:rPr>
+          <w:lang w:val="vi-VN"/>
+        </w:rPr>
+        <w:t>a c</w:t>
+      </w:r>
+      <w:r>
+        <w:rPr>
+          <w:lang w:val="vi-VN"/>
+        </w:rPr>
+        <w:t>ập</w:t>
+      </w:r>
+      <w:r>
+        <w:rPr>
+          <w:lang w:val="vi-VN"/>
+        </w:rPr>
+        <w:t xml:space="preserve"> nh</w:t>
+      </w:r>
+      <w:r>
+        <w:rPr>
+          <w:lang w:val="vi-VN"/>
+        </w:rPr>
+        <w:t>ậ</w:t>
+      </w:r>
+      <w:r>
+        <w:rPr>
+          <w:lang w:val="vi-VN"/>
+        </w:rPr>
+        <w:t>t t</w:t>
+      </w:r>
+      <w:r>
+        <w:rPr>
+          <w:lang w:val="vi-VN"/>
+        </w:rPr>
+        <w:t>ê</w:t>
+      </w:r>
+      <w:r>
+        <w:rPr>
+          <w:lang w:val="vi-VN"/>
+        </w:rPr>
+        <w:t>n sau khi s</w:t>
+      </w:r>
+      <w:r>
+        <w:rPr>
+          <w:lang w:val="vi-VN"/>
+        </w:rPr>
+        <w:t>áp</w:t>
+      </w:r>
+      <w:r>
+        <w:rPr>
+          <w:lang w:val="vi-VN"/>
+        </w:rPr>
+        <w:t xml:space="preserve"> nh</w:t>
+      </w:r>
+      <w:r>
+        <w:rPr>
+          <w:lang w:val="vi-VN"/>
+        </w:rPr>
+        <w:t>ập</w:t>
+      </w:r>
+      <w:r>
+        <w:rPr>
+          <w:lang w:val="vi-VN"/>
+        </w:rPr>
+        <w:t>.</w:t>
+      </w:r>
+    </w:p>
+    <w:p>
+      <w:pPr>
+        <w:rPr>
+          <w:lang w:val="vi-VN"/>
+        </w:rPr>
+      </w:pPr>
+      <w:r>
+        <w:rPr>
+          <w:lang w:val="vi-VN"/>
+        </w:rPr>
+        <w:t>Tại mỗi tỉnh trong một ngày cụ thể, thông tin đượ</w:t>
+      </w:r>
+      <w:r>
+        <w:rPr>
+          <w:lang w:val="vi-VN"/>
+        </w:rPr>
+        <w:t>c chia thành 4 nhóm chính:</w:t>
+      </w:r>
+    </w:p>
+    <w:p>
+      <w:pPr>
+        <w:pStyle w:val="ListParagraph"/>
+        <w:numPr>
+          <w:ilvl w:val="0"/>
+          <w:numId w:val="48"/>
+        </w:numPr>
+        <w:rPr>
+          <w:lang w:val="vi-VN"/>
+        </w:rPr>
+      </w:pPr>
+      <w:r>
+        <w:rPr>
+          <w:lang w:val="vi-VN"/>
+        </w:rPr>
+        <w:t>Giá thu mua cà phê (coffee_price_vnd_kg): Là giá cà phê nhân xô tại địa phương. Đây cũng là biến mục tiêu mà nghiên cứu cần dự báo.</w:t>
+      </w:r>
+    </w:p>
+    <w:p>
+      <w:pPr>
+        <w:pStyle w:val="ListParagraph"/>
+        <w:numPr>
+          <w:ilvl w:val="0"/>
+          <w:numId w:val="48"/>
+        </w:numPr>
+        <w:rPr>
+          <w:lang w:val="vi-VN"/>
+        </w:rPr>
+      </w:pPr>
+      <w:r>
+        <w:rPr>
+          <w:lang w:val="vi-VN"/>
+        </w:rPr>
+        <w:t>Yếu tố thị trường quốc tế và kinh tế vĩ mô: Gồm giá cà phê trên các sàn giao dịch thế giới (Robusta ở London, Arabica ở New York), tỷ giá ngoại tệ (USD/VND, USD/BRL), sức mạnh đồng USD (DXY), và chi phí năng lượng (giá dầu Brent, giá dầu diesel trong nước).</w:t>
+      </w:r>
+    </w:p>
+    <w:p>
+      <w:pPr>
+        <w:pStyle w:val="ListParagraph"/>
+        <w:numPr>
+          <w:ilvl w:val="0"/>
+          <w:numId w:val="48"/>
+        </w:numPr>
+        <w:rPr>
+          <w:lang w:val="vi-VN"/>
+        </w:rPr>
+      </w:pPr>
+      <w:r>
+        <w:rPr>
+          <w:lang w:val="vi-VN"/>
+        </w:rPr>
+        <w:lastRenderedPageBreak/>
+        <w:t>Yếu tố thời tiết và nông nghiệp: Gồm các chỉ số thời tiết chi tiết của từng tỉnh (nhiệt độ, lượng mưa, độ ẩm, bức xạ mặt trời, tốc độ gió) và thông tin đánh dấu thời gian diễn ra mùa vụ thu hoạch tại Việt Nam và Brazil.</w:t>
+      </w:r>
+    </w:p>
+    <w:p>
+      <w:pPr>
+        <w:pStyle w:val="ListParagraph"/>
+        <w:numPr>
+          <w:ilvl w:val="0"/>
+          <w:numId w:val="48"/>
+        </w:numPr>
+        <w:rPr>
+          <w:lang w:val="vi-VN"/>
+        </w:rPr>
+      </w:pPr>
+      <w:r>
+        <w:rPr>
+          <w:lang w:val="vi-VN"/>
+        </w:rPr>
+        <w:t>Yếu tố cung – cầu toàn cầu: Gồm các số liệu về lượng tồn kho, xuất khẩu, tiêu thụ và tổng sản lượng cà phê của Brazil, Việt Nam và toàn thế giới.</w:t>
+      </w:r>
+    </w:p>
+    <w:p>
+      <w:pPr>
+        <w:rPr>
+          <w:lang w:val="vi-VN"/>
+        </w:rPr>
+      </w:pPr>
+      <w:r>
+        <w:rPr>
+          <w:lang w:val="vi-VN"/>
+        </w:rPr>
+        <w:t>Trong khi giá cả hay thời tiết đ</w:t>
+      </w:r>
+      <w:r>
+        <w:rPr>
+          <w:lang w:val="vi-VN"/>
+        </w:rPr>
+        <w:t>ượ</w:t>
+      </w:r>
+      <w:r>
+        <w:rPr>
+          <w:lang w:val="vi-VN"/>
+        </w:rPr>
+        <w:t>c c</w:t>
+      </w:r>
+      <w:r>
+        <w:rPr>
+          <w:lang w:val="vi-VN"/>
+        </w:rPr>
+        <w:t>ập</w:t>
+      </w:r>
+      <w:r>
+        <w:rPr>
+          <w:lang w:val="vi-VN"/>
+        </w:rPr>
+        <w:t xml:space="preserve"> nh</w:t>
+      </w:r>
+      <w:r>
+        <w:rPr>
+          <w:lang w:val="vi-VN"/>
+        </w:rPr>
+        <w:t>ậ</w:t>
+      </w:r>
+      <w:r>
+        <w:rPr>
+          <w:lang w:val="vi-VN"/>
+        </w:rPr>
+        <w:t>t theo t</w:t>
+      </w:r>
+      <w:r>
+        <w:rPr>
+          <w:lang w:val="vi-VN"/>
+        </w:rPr>
+        <w:t>ừng</w:t>
+      </w:r>
+      <w:r>
+        <w:rPr>
+          <w:lang w:val="vi-VN"/>
+        </w:rPr>
+        <w:t xml:space="preserve"> ng</w:t>
+      </w:r>
+      <w:r>
+        <w:rPr>
+          <w:lang w:val="vi-VN"/>
+        </w:rPr>
+        <w:t>ày</w:t>
+      </w:r>
+      <w:r>
+        <w:rPr>
+          <w:lang w:val="vi-VN"/>
+        </w:rPr>
+        <w:t>, th</w:t>
+      </w:r>
+      <w:r>
+        <w:rPr>
+          <w:lang w:val="vi-VN"/>
+        </w:rPr>
+        <w:t>ì</w:t>
+      </w:r>
+      <w:r>
+        <w:rPr>
+          <w:lang w:val="vi-VN"/>
+        </w:rPr>
+        <w:t xml:space="preserve"> c</w:t>
+      </w:r>
+      <w:r>
+        <w:rPr>
+          <w:lang w:val="vi-VN"/>
+        </w:rPr>
+        <w:t xml:space="preserve">ác </w:t>
+      </w:r>
+      <w:r>
+        <w:rPr>
+          <w:lang w:val="vi-VN"/>
+        </w:rPr>
+        <w:t>d</w:t>
+      </w:r>
+      <w:r>
+        <w:rPr>
+          <w:lang w:val="vi-VN"/>
+        </w:rPr>
+        <w:t>ữ</w:t>
+      </w:r>
+      <w:r>
+        <w:rPr>
+          <w:lang w:val="vi-VN"/>
+        </w:rPr>
+        <w:t xml:space="preserve"> li</w:t>
+      </w:r>
+      <w:r>
+        <w:rPr>
+          <w:lang w:val="vi-VN"/>
+        </w:rPr>
+        <w:t xml:space="preserve">ệu </w:t>
+      </w:r>
+      <w:r>
+        <w:rPr>
+          <w:lang w:val="vi-VN"/>
+        </w:rPr>
+        <w:t>v</w:t>
+      </w:r>
+      <w:r>
+        <w:rPr>
+          <w:lang w:val="vi-VN"/>
+        </w:rPr>
+        <w:t>ề</w:t>
+      </w:r>
+      <w:r>
+        <w:rPr>
+          <w:lang w:val="vi-VN"/>
+        </w:rPr>
+        <w:t xml:space="preserve"> y</w:t>
+      </w:r>
+      <w:r>
+        <w:rPr>
+          <w:lang w:val="vi-VN"/>
+        </w:rPr>
+        <w:t xml:space="preserve">ếu </w:t>
+      </w:r>
+      <w:r>
+        <w:rPr>
+          <w:lang w:val="vi-VN"/>
+        </w:rPr>
+        <w:t>t</w:t>
+      </w:r>
+      <w:r>
+        <w:rPr>
+          <w:lang w:val="vi-VN"/>
+        </w:rPr>
+        <w:t>ố</w:t>
+      </w:r>
+      <w:r>
+        <w:rPr>
+          <w:lang w:val="vi-VN"/>
+        </w:rPr>
+        <w:t xml:space="preserve"> cung c</w:t>
+      </w:r>
+      <w:r>
+        <w:rPr>
+          <w:lang w:val="vi-VN"/>
+        </w:rPr>
+        <w:t>ầu</w:t>
+      </w:r>
+      <w:r>
+        <w:rPr>
+          <w:lang w:val="vi-VN"/>
+        </w:rPr>
+        <w:t xml:space="preserve"> th</w:t>
+      </w:r>
+      <w:r>
+        <w:rPr>
+          <w:lang w:val="vi-VN"/>
+        </w:rPr>
+        <w:t>ường</w:t>
+      </w:r>
+      <w:r>
+        <w:rPr>
+          <w:lang w:val="vi-VN"/>
+        </w:rPr>
+        <w:t xml:space="preserve"> ch</w:t>
+      </w:r>
+      <w:r>
+        <w:rPr>
+          <w:lang w:val="vi-VN"/>
+        </w:rPr>
+        <w:t>ỉ</w:t>
+      </w:r>
+      <w:r>
+        <w:rPr>
+          <w:lang w:val="vi-VN"/>
+        </w:rPr>
+        <w:t xml:space="preserve"> th</w:t>
+      </w:r>
+      <w:r>
+        <w:rPr>
+          <w:lang w:val="vi-VN"/>
+        </w:rPr>
+        <w:t>ống</w:t>
+      </w:r>
+      <w:r>
+        <w:rPr>
+          <w:lang w:val="vi-VN"/>
+        </w:rPr>
+        <w:t xml:space="preserve"> k</w:t>
+      </w:r>
+      <w:r>
+        <w:rPr>
+          <w:lang w:val="vi-VN"/>
+        </w:rPr>
+        <w:t>ê</w:t>
+      </w:r>
+      <w:r>
+        <w:rPr>
+          <w:lang w:val="vi-VN"/>
+        </w:rPr>
+        <w:t xml:space="preserve"> theo n</w:t>
+      </w:r>
+      <w:r>
+        <w:rPr>
+          <w:lang w:val="vi-VN"/>
+        </w:rPr>
+        <w:t>ă</w:t>
+      </w:r>
+      <w:r>
+        <w:rPr>
+          <w:lang w:val="vi-VN"/>
+        </w:rPr>
+        <w:t>m. Để đưa vào tập dữ liệu, các số liệu n</w:t>
+      </w:r>
+      <w:r>
+        <w:rPr>
+          <w:lang w:val="vi-VN"/>
+        </w:rPr>
+        <w:t>ày đượ</w:t>
+      </w:r>
+      <w:r>
+        <w:rPr>
+          <w:lang w:val="vi-VN"/>
+        </w:rPr>
+        <w:t>c l</w:t>
+      </w:r>
+      <w:r>
+        <w:rPr>
+          <w:lang w:val="vi-VN"/>
+        </w:rPr>
+        <w:t>ặp</w:t>
+      </w:r>
+      <w:r>
+        <w:rPr>
+          <w:lang w:val="vi-VN"/>
+        </w:rPr>
+        <w:t xml:space="preserve"> l</w:t>
+      </w:r>
+      <w:r>
+        <w:rPr>
+          <w:lang w:val="vi-VN"/>
+        </w:rPr>
+        <w:t>ại</w:t>
+      </w:r>
+      <w:r>
+        <w:rPr>
+          <w:lang w:val="vi-VN"/>
+        </w:rPr>
+        <w:t xml:space="preserve"> cho t</w:t>
+      </w:r>
+      <w:r>
+        <w:rPr>
+          <w:lang w:val="vi-VN"/>
+        </w:rPr>
+        <w:t>ừng</w:t>
+      </w:r>
+      <w:r>
+        <w:rPr>
+          <w:lang w:val="vi-VN"/>
+        </w:rPr>
+        <w:t xml:space="preserve"> ng</w:t>
+      </w:r>
+      <w:r>
+        <w:rPr>
+          <w:lang w:val="vi-VN"/>
+        </w:rPr>
+        <w:t>ày</w:t>
+      </w:r>
+      <w:r>
+        <w:rPr>
+          <w:lang w:val="vi-VN"/>
+        </w:rPr>
+        <w:t xml:space="preserve"> trong n</w:t>
+      </w:r>
+      <w:r>
+        <w:rPr>
+          <w:lang w:val="vi-VN"/>
+        </w:rPr>
+        <w:t>ă</w:t>
+      </w:r>
+      <w:r>
+        <w:rPr>
+          <w:lang w:val="vi-VN"/>
+        </w:rPr>
+        <w:t xml:space="preserve">m </w:t>
+      </w:r>
+      <w:r>
+        <w:rPr>
+          <w:lang w:val="vi-VN"/>
+        </w:rPr>
+        <w:t>đó</w:t>
+      </w:r>
+      <w:r>
+        <w:rPr>
+          <w:lang w:val="vi-VN"/>
+        </w:rPr>
+        <w:t>.</w:t>
       </w:r>
     </w:p>
     <w:p>
@@ -20655,7 +23491,396 @@
         <w:rPr>
           <w:lang w:val="vi-VN"/>
         </w:rPr>
-        <w:t>3.2.2. Phân loại biến Nội sinh (Y) và Ngoại sinh (X</w:t>
+        <w:t>3.2.2. Tiền xử lý dữ li</w:t>
+      </w:r>
+      <w:r>
+        <w:rPr>
+          <w:lang w:val="vi-VN"/>
+        </w:rPr>
+        <w:t>ệu</w:t>
+      </w:r>
+    </w:p>
+    <w:p>
+      <w:r>
+        <w:rPr>
+          <w:lang w:val="vi-VN"/>
+        </w:rPr>
+        <w:t>Để đảm bảo tính nh</w:t>
+      </w:r>
+      <w:r>
+        <w:rPr>
+          <w:lang w:val="vi-VN"/>
+        </w:rPr>
+        <w:t>ất</w:t>
+      </w:r>
+      <w:r>
+        <w:rPr>
+          <w:lang w:val="vi-VN"/>
+        </w:rPr>
+        <w:t xml:space="preserve"> qu</w:t>
+      </w:r>
+      <w:r>
+        <w:rPr>
+          <w:lang w:val="vi-VN"/>
+        </w:rPr>
+        <w:t>á</w:t>
+      </w:r>
+      <w:r>
+        <w:rPr>
+          <w:lang w:val="vi-VN"/>
+        </w:rPr>
+        <w:t>n, li</w:t>
+      </w:r>
+      <w:r>
+        <w:rPr>
+          <w:lang w:val="vi-VN"/>
+        </w:rPr>
+        <w:t>ền</w:t>
+      </w:r>
+      <w:r>
+        <w:rPr>
+          <w:lang w:val="vi-VN"/>
+        </w:rPr>
+        <w:t xml:space="preserve"> m</w:t>
+      </w:r>
+      <w:r>
+        <w:rPr>
+          <w:lang w:val="vi-VN"/>
+        </w:rPr>
+        <w:t xml:space="preserve">ạch </w:t>
+      </w:r>
+      <w:r>
+        <w:rPr>
+          <w:lang w:val="vi-VN"/>
+        </w:rPr>
+        <w:t>v</w:t>
+      </w:r>
+      <w:r>
+        <w:rPr>
+          <w:lang w:val="vi-VN"/>
+        </w:rPr>
+        <w:t>à</w:t>
+      </w:r>
+      <w:r>
+        <w:rPr>
+          <w:lang w:val="vi-VN"/>
+        </w:rPr>
+        <w:t xml:space="preserve"> t</w:t>
+      </w:r>
+      <w:r>
+        <w:rPr>
+          <w:lang w:val="vi-VN"/>
+        </w:rPr>
+        <w:t>ă</w:t>
+      </w:r>
+      <w:r>
+        <w:rPr>
+          <w:lang w:val="vi-VN"/>
+        </w:rPr>
+        <w:t xml:space="preserve">ng </w:t>
+      </w:r>
+      <w:r>
+        <w:rPr>
+          <w:lang w:val="vi-VN"/>
+        </w:rPr>
+        <w:t>độ</w:t>
+      </w:r>
+      <w:r>
+        <w:rPr>
+          <w:lang w:val="vi-VN"/>
+        </w:rPr>
+        <w:t xml:space="preserve"> tin c</w:t>
+      </w:r>
+      <w:r>
+        <w:rPr>
+          <w:lang w:val="vi-VN"/>
+        </w:rPr>
+        <w:t>ậy</w:t>
+      </w:r>
+      <w:r>
+        <w:rPr>
+          <w:lang w:val="vi-VN"/>
+        </w:rPr>
+        <w:t xml:space="preserve"> c</w:t>
+      </w:r>
+      <w:r>
+        <w:rPr>
+          <w:lang w:val="vi-VN"/>
+        </w:rPr>
+        <w:t>ủa</w:t>
+      </w:r>
+      <w:r>
+        <w:rPr>
+          <w:lang w:val="vi-VN"/>
+        </w:rPr>
+        <w:t xml:space="preserve"> d</w:t>
+      </w:r>
+      <w:r>
+        <w:rPr>
+          <w:lang w:val="vi-VN"/>
+        </w:rPr>
+        <w:t>ữ</w:t>
+      </w:r>
+      <w:r>
+        <w:rPr>
+          <w:lang w:val="vi-VN"/>
+        </w:rPr>
+        <w:t xml:space="preserve"> li</w:t>
+      </w:r>
+      <w:r>
+        <w:rPr>
+          <w:lang w:val="vi-VN"/>
+        </w:rPr>
+        <w:t>ệu</w:t>
+      </w:r>
+      <w:r>
+        <w:rPr>
+          <w:lang w:val="vi-VN"/>
+        </w:rPr>
+        <w:t xml:space="preserve"> </w:t>
+      </w:r>
+      <w:r>
+        <w:rPr>
+          <w:lang w:val="vi-VN"/>
+        </w:rPr>
+        <w:t>đầu</w:t>
+      </w:r>
+      <w:r>
+        <w:rPr>
+          <w:lang w:val="vi-VN"/>
+        </w:rPr>
+        <w:t xml:space="preserve"> v</w:t>
+      </w:r>
+      <w:r>
+        <w:rPr>
+          <w:lang w:val="vi-VN"/>
+        </w:rPr>
+        <w:t>ào</w:t>
+      </w:r>
+      <w:r>
+        <w:rPr>
+          <w:lang w:val="vi-VN"/>
+        </w:rPr>
+        <w:t>, d</w:t>
+      </w:r>
+      <w:r>
+        <w:rPr>
+          <w:lang w:val="vi-VN"/>
+        </w:rPr>
+        <w:t>ữ</w:t>
+      </w:r>
+      <w:r>
+        <w:rPr>
+          <w:lang w:val="vi-VN"/>
+        </w:rPr>
+        <w:t xml:space="preserve"> li</w:t>
+      </w:r>
+      <w:r>
+        <w:rPr>
+          <w:lang w:val="vi-VN"/>
+        </w:rPr>
+        <w:t>ệu</w:t>
+      </w:r>
+      <w:r>
+        <w:rPr>
+          <w:lang w:val="vi-VN"/>
+        </w:rPr>
+        <w:t xml:space="preserve"> s</w:t>
+      </w:r>
+      <w:r>
+        <w:rPr>
+          <w:lang w:val="vi-VN"/>
+        </w:rPr>
+        <w:t>ẽ</w:t>
+      </w:r>
+      <w:r>
+        <w:rPr>
+          <w:lang w:val="vi-VN"/>
+        </w:rPr>
+        <w:t xml:space="preserve"> </w:t>
+      </w:r>
+      <w:r>
+        <w:rPr>
+          <w:lang w:val="vi-VN"/>
+        </w:rPr>
+        <w:t>tr</w:t>
+      </w:r>
+      <w:r>
+        <w:rPr>
+          <w:lang w:val="vi-VN"/>
+        </w:rPr>
+        <w:t>ải</w:t>
+      </w:r>
+      <w:r>
+        <w:rPr>
+          <w:lang w:val="vi-VN"/>
+        </w:rPr>
+        <w:t xml:space="preserve"> qua </w:t>
+      </w:r>
+      <w:r>
+        <w:rPr>
+          <w:lang w:val="vi-VN"/>
+        </w:rPr>
+        <w:t>c</w:t>
+      </w:r>
+      <w:r>
+        <w:rPr>
+          <w:lang w:val="vi-VN"/>
+        </w:rPr>
+        <w:t>ác</w:t>
+      </w:r>
+      <w:r>
+        <w:rPr>
+          <w:lang w:val="vi-VN"/>
+        </w:rPr>
+        <w:t xml:space="preserve"> </w:t>
+      </w:r>
+      <w:r>
+        <w:rPr>
+          <w:lang w:val="vi-VN"/>
+        </w:rPr>
+        <w:t>quy tr</w:t>
+      </w:r>
+      <w:r>
+        <w:rPr>
+          <w:lang w:val="vi-VN"/>
+        </w:rPr>
+        <w:t xml:space="preserve">ình </w:t>
+      </w:r>
+      <w:r>
+        <w:rPr>
+          <w:lang w:val="vi-VN"/>
+        </w:rPr>
+        <w:t>ti</w:t>
+      </w:r>
+      <w:r>
+        <w:rPr>
+          <w:lang w:val="vi-VN"/>
+        </w:rPr>
+        <w:t>ền</w:t>
+      </w:r>
+      <w:r>
+        <w:rPr>
+          <w:lang w:val="vi-VN"/>
+        </w:rPr>
+        <w:t xml:space="preserve"> x</w:t>
+      </w:r>
+      <w:r>
+        <w:rPr>
+          <w:lang w:val="vi-VN"/>
+        </w:rPr>
+        <w:t>ử</w:t>
+      </w:r>
+      <w:r>
+        <w:rPr>
+          <w:lang w:val="vi-VN"/>
+        </w:rPr>
+        <w:t xml:space="preserve"> l</w:t>
+      </w:r>
+      <w:r>
+        <w:rPr>
+          <w:lang w:val="vi-VN"/>
+        </w:rPr>
+        <w:t>ý</w:t>
+      </w:r>
+      <w:r>
+        <w:rPr>
+          <w:lang w:val="vi-VN"/>
+        </w:rPr>
+        <w:t xml:space="preserve"> đ</w:t>
+      </w:r>
+      <w:r>
+        <w:rPr>
+          <w:lang w:val="vi-VN"/>
+        </w:rPr>
+        <w:t>ượ</w:t>
+      </w:r>
+      <w:r>
+        <w:rPr>
+          <w:lang w:val="vi-VN"/>
+        </w:rPr>
+        <w:t>c thi</w:t>
+      </w:r>
+      <w:r>
+        <w:rPr>
+          <w:lang w:val="vi-VN"/>
+        </w:rPr>
+        <w:t>ết</w:t>
+      </w:r>
+      <w:r>
+        <w:rPr>
+          <w:lang w:val="vi-VN"/>
+        </w:rPr>
+        <w:t xml:space="preserve"> k</w:t>
+      </w:r>
+      <w:r>
+        <w:rPr>
+          <w:lang w:val="vi-VN"/>
+        </w:rPr>
+        <w:t>ế</w:t>
+      </w:r>
+      <w:r>
+        <w:rPr>
+          <w:lang w:val="vi-VN"/>
+        </w:rPr>
+        <w:t xml:space="preserve"> </w:t>
+      </w:r>
+      <w:r>
+        <w:rPr>
+          <w:lang w:val="vi-VN"/>
+        </w:rPr>
+        <w:t>nghi</w:t>
+      </w:r>
+      <w:r>
+        <w:rPr>
+          <w:lang w:val="vi-VN"/>
+        </w:rPr>
+        <w:t>ê</w:t>
+      </w:r>
+      <w:r>
+        <w:rPr>
+          <w:lang w:val="vi-VN"/>
+        </w:rPr>
+        <w:t>m ng</w:t>
+      </w:r>
+      <w:r>
+        <w:rPr>
+          <w:lang w:val="vi-VN"/>
+        </w:rPr>
+        <w:t>ặ</w:t>
+      </w:r>
+      <w:r>
+        <w:rPr>
+          <w:lang w:val="vi-VN"/>
+        </w:rPr>
+        <w:t>t.</w:t>
+      </w:r>
+    </w:p>
+    <w:p>
+      <w:pPr>
+        <w:pStyle w:val="Heading3"/>
+        <w:ind w:firstLine="0"/>
+        <w:rPr>
+          <w:lang w:val="vi-VN"/>
+        </w:rPr>
+      </w:pPr>
+      <w:r>
+        <w:rPr>
+          <w:lang w:val="vi-VN"/>
+        </w:rPr>
+        <w:t>3.2.</w:t>
+      </w:r>
+      <w:r>
+        <w:rPr>
+          <w:lang w:val="vi-VN"/>
+        </w:rPr>
+        <w:t>3</w:t>
+      </w:r>
+      <w:r>
+        <w:rPr>
+          <w:lang w:val="vi-VN"/>
+        </w:rPr>
+        <w:t>. Phân loại biến Nội sinh (Y) và Ngoại sinh (X</w:t>
       </w:r>
       <w:r>
         <w:rPr>
@@ -20711,21 +23936,26 @@
     </w:p>
     <w:p>
       <w:pPr>
+        <w:pStyle w:val="Heading2"/>
+        <w:ind w:firstLine="0"/>
+      </w:pPr>
+      <w:bookmarkStart w:id="6" w:name="_Toc232273029"/>
+      <w:r>
+        <w:rPr>
+          <w:lang w:val="vi-VN"/>
+        </w:rPr>
+        <w:t>3.4. Kết c</w:t>
+      </w:r>
+      <w:r>
+        <w:t>hương</w:t>
+      </w:r>
+    </w:p>
+    <w:p>
+      <w:pPr>
         <w:ind w:firstLine="0"/>
         <w:jc w:val="left"/>
-        <w:rPr>
-          <w:b/>
-          <w:bCs/>
-          <w:lang w:val="vi-VN"/>
-        </w:rPr>
-      </w:pPr>
-      <w:bookmarkStart w:id="6" w:name="_Toc232273029"/>
-      <w:r>
-        <w:rPr>
-          <w:b/>
-          <w:bCs/>
-          <w:lang w:val="vi-VN"/>
-        </w:rPr>
+      </w:pPr>
+      <w:r>
         <w:br w:type="page"/>
       </w:r>
     </w:p>
@@ -20887,6 +24117,15 @@
     </w:p>
     <w:p>
       <w:pPr>
+        <w:pStyle w:val="Heading2"/>
+        <w:ind w:firstLine="0"/>
+      </w:pPr>
+      <w:r>
+        <w:t>4.5. Kết chương</w:t>
+      </w:r>
+    </w:p>
+    <w:p>
+      <w:pPr>
         <w:ind w:firstLine="0"/>
         <w:jc w:val="left"/>
         <w:rPr>
@@ -21037,6 +24276,15 @@
           <w:lang w:val="vi-VN"/>
         </w:rPr>
         <w:t>5.3. So sánh hiệu suất giữa các tỉnh: Phân tích lý do tỉnh nào dễ dự báo nhất và tỉnh nào khó dự báo nhất.</w:t>
+      </w:r>
+    </w:p>
+    <w:p>
+      <w:pPr>
+        <w:pStyle w:val="Heading2"/>
+        <w:ind w:firstLine="0"/>
+      </w:pPr>
+      <w:r>
+        <w:t>5.4. Kết chương</w:t>
       </w:r>
     </w:p>
     <w:p>
@@ -21065,6 +24313,8 @@
           <w:lang w:val="vi-VN"/>
         </w:rPr>
       </w:pPr>
+      <w:bookmarkStart w:id="7" w:name="_GoBack"/>
+      <w:bookmarkEnd w:id="7"/>
       <w:r>
         <w:rPr>
           <w:lang w:val="vi-VN"/>
@@ -21073,6 +24323,9 @@
         <w:t>C</w:t>
       </w:r>
       <w:r>
+        <w:rPr>
+          <w:lang w:val="vi-VN"/>
+        </w:rPr>
         <w:t>hương</w:t>
       </w:r>
       <w:r>
@@ -21124,7 +24377,7 @@
           <w:lang w:val="vi-VN"/>
         </w:rPr>
       </w:pPr>
-      <w:bookmarkStart w:id="7" w:name="_Toc232273043"/>
+      <w:bookmarkStart w:id="8" w:name="_Toc232273043"/>
       <w:r>
         <w:rPr>
           <w:b/>
@@ -21134,7 +24387,7 @@
         <w:lastRenderedPageBreak/>
         <w:t>PHẦN KẾT LUẬN</w:t>
       </w:r>
-      <w:bookmarkEnd w:id="7"/>
+      <w:bookmarkEnd w:id="8"/>
     </w:p>
     <w:p>
       <w:pPr>
@@ -21154,8 +24407,6 @@
         </w:rPr>
         <w:br w:type="page"/>
       </w:r>
-      <w:bookmarkStart w:id="8" w:name="_GoBack"/>
-      <w:bookmarkEnd w:id="8"/>
     </w:p>
     <w:p>
       <w:pPr>
@@ -21289,7 +24540,7 @@
           <w:rPr>
             <w:noProof/>
           </w:rPr>
-          <w:t>27</w:t>
+          <w:t>32</w:t>
         </w:r>
         <w:r>
           <w:rPr>
@@ -26849,6 +30100,119 @@
     </w:lvl>
   </w:abstractNum>
   <w:abstractNum w:abstractNumId="46" w15:restartNumberingAfterBreak="0">
+    <w:nsid w:val="77C33A30"/>
+    <w:multiLevelType w:val="hybridMultilevel"/>
+    <w:tmpl w:val="1B0E3FE6"/>
+    <w:lvl w:ilvl="0" w:tplc="04090001">
+      <w:start w:val="1"/>
+      <w:numFmt w:val="bullet"/>
+      <w:lvlText w:val=""/>
+      <w:lvlJc w:val="left"/>
+      <w:pPr>
+        <w:ind w:left="1440" w:hanging="360"/>
+      </w:pPr>
+      <w:rPr>
+        <w:rFonts w:ascii="Symbol" w:hAnsi="Symbol" w:hint="default"/>
+      </w:rPr>
+    </w:lvl>
+    <w:lvl w:ilvl="1" w:tplc="042A0003" w:tentative="1">
+      <w:start w:val="1"/>
+      <w:numFmt w:val="bullet"/>
+      <w:lvlText w:val="o"/>
+      <w:lvlJc w:val="left"/>
+      <w:pPr>
+        <w:ind w:left="2160" w:hanging="360"/>
+      </w:pPr>
+      <w:rPr>
+        <w:rFonts w:ascii="Courier New" w:hAnsi="Courier New" w:cs="Courier New" w:hint="default"/>
+      </w:rPr>
+    </w:lvl>
+    <w:lvl w:ilvl="2" w:tplc="042A0005" w:tentative="1">
+      <w:start w:val="1"/>
+      <w:numFmt w:val="bullet"/>
+      <w:lvlText w:val=""/>
+      <w:lvlJc w:val="left"/>
+      <w:pPr>
+        <w:ind w:left="2880" w:hanging="360"/>
+      </w:pPr>
+      <w:rPr>
+        <w:rFonts w:ascii="Wingdings" w:hAnsi="Wingdings" w:hint="default"/>
+      </w:rPr>
+    </w:lvl>
+    <w:lvl w:ilvl="3" w:tplc="042A0001" w:tentative="1">
+      <w:start w:val="1"/>
+      <w:numFmt w:val="bullet"/>
+      <w:lvlText w:val=""/>
+      <w:lvlJc w:val="left"/>
+      <w:pPr>
+        <w:ind w:left="3600" w:hanging="360"/>
+      </w:pPr>
+      <w:rPr>
+        <w:rFonts w:ascii="Symbol" w:hAnsi="Symbol" w:hint="default"/>
+      </w:rPr>
+    </w:lvl>
+    <w:lvl w:ilvl="4" w:tplc="042A0003" w:tentative="1">
+      <w:start w:val="1"/>
+      <w:numFmt w:val="bullet"/>
+      <w:lvlText w:val="o"/>
+      <w:lvlJc w:val="left"/>
+      <w:pPr>
+        <w:ind w:left="4320" w:hanging="360"/>
+      </w:pPr>
+      <w:rPr>
+        <w:rFonts w:ascii="Courier New" w:hAnsi="Courier New" w:cs="Courier New" w:hint="default"/>
+      </w:rPr>
+    </w:lvl>
+    <w:lvl w:ilvl="5" w:tplc="042A0005" w:tentative="1">
+      <w:start w:val="1"/>
+      <w:numFmt w:val="bullet"/>
+      <w:lvlText w:val=""/>
+      <w:lvlJc w:val="left"/>
+      <w:pPr>
+        <w:ind w:left="5040" w:hanging="360"/>
+      </w:pPr>
+      <w:rPr>
+        <w:rFonts w:ascii="Wingdings" w:hAnsi="Wingdings" w:hint="default"/>
+      </w:rPr>
+    </w:lvl>
+    <w:lvl w:ilvl="6" w:tplc="042A0001" w:tentative="1">
+      <w:start w:val="1"/>
+      <w:numFmt w:val="bullet"/>
+      <w:lvlText w:val=""/>
+      <w:lvlJc w:val="left"/>
+      <w:pPr>
+        <w:ind w:left="5760" w:hanging="360"/>
+      </w:pPr>
+      <w:rPr>
+        <w:rFonts w:ascii="Symbol" w:hAnsi="Symbol" w:hint="default"/>
+      </w:rPr>
+    </w:lvl>
+    <w:lvl w:ilvl="7" w:tplc="042A0003" w:tentative="1">
+      <w:start w:val="1"/>
+      <w:numFmt w:val="bullet"/>
+      <w:lvlText w:val="o"/>
+      <w:lvlJc w:val="left"/>
+      <w:pPr>
+        <w:ind w:left="6480" w:hanging="360"/>
+      </w:pPr>
+      <w:rPr>
+        <w:rFonts w:ascii="Courier New" w:hAnsi="Courier New" w:cs="Courier New" w:hint="default"/>
+      </w:rPr>
+    </w:lvl>
+    <w:lvl w:ilvl="8" w:tplc="042A0005" w:tentative="1">
+      <w:start w:val="1"/>
+      <w:numFmt w:val="bullet"/>
+      <w:lvlText w:val=""/>
+      <w:lvlJc w:val="left"/>
+      <w:pPr>
+        <w:ind w:left="7200" w:hanging="360"/>
+      </w:pPr>
+      <w:rPr>
+        <w:rFonts w:ascii="Wingdings" w:hAnsi="Wingdings" w:hint="default"/>
+      </w:rPr>
+    </w:lvl>
+  </w:abstractNum>
+  <w:abstractNum w:abstractNumId="47" w15:restartNumberingAfterBreak="0">
     <w:nsid w:val="7A55602C"/>
     <w:multiLevelType w:val="hybridMultilevel"/>
     <w:tmpl w:val="91807372"/>
@@ -27064,7 +30428,7 @@
     <w:abstractNumId w:val="22"/>
   </w:num>
   <w:num w:numId="35">
-    <w:abstractNumId w:val="46"/>
+    <w:abstractNumId w:val="47"/>
   </w:num>
   <w:num w:numId="36">
     <w:abstractNumId w:val="20"/>
@@ -27101,6 +30465,9 @@
   </w:num>
   <w:num w:numId="47">
     <w:abstractNumId w:val="32"/>
+  </w:num>
+  <w:num w:numId="48">
+    <w:abstractNumId w:val="46"/>
   </w:num>
   <w:numIdMacAtCleanup w:val="22"/>
 </w:numbering>
@@ -28822,7 +32189,7 @@
 </file>
 
 <file path=customXml/itemProps1.xml><?xml version="1.0" encoding="utf-8"?>
-<ds:datastoreItem xmlns:ds="http://schemas.openxmlformats.org/officeDocument/2006/customXml" ds:itemID="{A9789B18-CE69-41BF-8D88-A95824315AC2}">
+<ds:datastoreItem xmlns:ds="http://schemas.openxmlformats.org/officeDocument/2006/customXml" ds:itemID="{BC6F8BB2-BF2B-4925-A4DE-B9B8AC182183}">
   <ds:schemaRefs>
     <ds:schemaRef ds:uri="http://schemas.openxmlformats.org/officeDocument/2006/bibliography"/>
   </ds:schemaRefs>

</xml_diff>